<commit_message>
Consolidate manuscript source and refresh DOCX styling
</commit_message>
<xml_diff>
--- a/ImperfectStudent_manuscript_v6.docx
+++ b/ImperfectStudent_manuscript_v6.docx
@@ -3796,14 +3796,31 @@
     </w:p>
     <w:p>
       <w:pPr>
-        <w:pStyle w:val="TableCaption"/>
-        <w:jc w:val="left"/>
+        <w:spacing w:before="160" w:after="60" w:line="240" w:lineRule="auto"/>
         <w:keepNext/>
         <w:keepLines/>
         <w:widowControl w:val="1"/>
       </w:pPr>
       <w:r>
-        <w:t xml:space="preserve">Table 1: Grade-level skill families used to structure MathCAMPS.</w:t>
+        <w:rPr>
+          <w:b/>
+          <w:i/>
+        </w:rPr>
+        <w:t>Table 1:</w:t>
+      </w:r>
+      <w:r>
+        <w:rPr>
+          <w:b w:val="0"/>
+          <w:i/>
+        </w:rPr>
+        <w:t xml:space="preserve"> </w:t>
+      </w:r>
+      <w:r>
+        <w:rPr>
+          <w:b w:val="0"/>
+          <w:i/>
+        </w:rPr>
+        <w:t>Grade-level skill families used to structure MathCAMPS.</w:t>
       </w:r>
     </w:p>
     <w:tbl>
@@ -3817,10 +3834,10 @@
         <w:tblBorders>
           <w:top w:val="single" w:sz="10" w:color="4F6272"/>
           <w:bottom w:val="single" w:sz="10" w:color="4F6272"/>
-          <w:insideH w:val="single" w:sz="4" w:color="D9E1E8"/>
-          <w:left w:val="nil"/>
-          <w:right w:val="nil"/>
-          <w:insideV w:val="nil"/>
+          <w:insideH w:val="single" w:sz="5" w:color="9FB0C2"/>
+          <w:left w:val="single" w:sz="6" w:color="9FB0C2"/>
+          <w:right w:val="single" w:sz="6" w:color="9FB0C2"/>
+          <w:insideV w:val="single" w:sz="5" w:color="D9E1E8"/>
         </w:tblBorders>
       </w:tblPr>
       <w:tblGrid>
@@ -3835,9 +3852,9 @@
           <w:tcPr>
             <w:shd w:fill="EEF3F7"/>
             <w:tcBorders>
-              <w:left w:val="nil"/>
-              <w:right w:val="nil"/>
-              <w:top w:val="nil"/>
+              <w:left w:val="single" w:sz="4" w:color="D9E1E8"/>
+              <w:right w:val="single" w:sz="4" w:color="D9E1E8"/>
+              <w:top w:val="single" w:sz="4" w:color="D9E1E8"/>
               <w:bottom w:val="single" w:sz="8" w:color="9FB0C2"/>
             </w:tcBorders>
           </w:tcPr>
@@ -3864,9 +3881,9 @@
           <w:tcPr>
             <w:shd w:fill="EEF3F7"/>
             <w:tcBorders>
-              <w:left w:val="nil"/>
-              <w:right w:val="nil"/>
-              <w:top w:val="nil"/>
+              <w:left w:val="single" w:sz="4" w:color="D9E1E8"/>
+              <w:right w:val="single" w:sz="4" w:color="D9E1E8"/>
+              <w:top w:val="single" w:sz="4" w:color="D9E1E8"/>
               <w:bottom w:val="single" w:sz="8" w:color="9FB0C2"/>
             </w:tcBorders>
           </w:tcPr>
@@ -3874,7 +3891,7 @@
             <w:pPr>
               <w:pStyle w:val="Compact"/>
               <w:spacing w:before="0" w:after="20" w:line="240" w:lineRule="auto"/>
-              <w:jc w:val="left"/>
+              <w:jc w:val="center"/>
               <w:keepNext w:val="0"/>
               <w:keepLines/>
               <w:widowControl w:val="1"/>
@@ -3894,9 +3911,9 @@
         <w:tc>
           <w:tcPr>
             <w:tcBorders>
-              <w:left w:val="nil"/>
-              <w:right w:val="nil"/>
-              <w:top w:val="nil"/>
+              <w:left w:val="single" w:sz="4" w:color="D9E1E8"/>
+              <w:right w:val="single" w:sz="4" w:color="D9E1E8"/>
+              <w:top w:val="single" w:sz="4" w:color="D9E1E8"/>
               <w:bottom w:val="single" w:sz="4" w:color="D9E1E8"/>
             </w:tcBorders>
           </w:tcPr>
@@ -3921,9 +3938,9 @@
         <w:tc>
           <w:tcPr>
             <w:tcBorders>
-              <w:left w:val="nil"/>
-              <w:right w:val="nil"/>
-              <w:top w:val="nil"/>
+              <w:left w:val="single" w:sz="4" w:color="D9E1E8"/>
+              <w:right w:val="single" w:sz="4" w:color="D9E1E8"/>
+              <w:top w:val="single" w:sz="4" w:color="D9E1E8"/>
               <w:bottom w:val="single" w:sz="4" w:color="D9E1E8"/>
             </w:tcBorders>
           </w:tcPr>
@@ -3931,7 +3948,7 @@
             <w:pPr>
               <w:pStyle w:val="Compact"/>
               <w:spacing w:before="0" w:after="20" w:line="240" w:lineRule="auto"/>
-              <w:jc w:val="left"/>
+              <w:jc w:val="center"/>
               <w:keepNext w:val="0"/>
               <w:keepLines/>
               <w:widowControl w:val="1"/>
@@ -3950,9 +3967,9 @@
         <w:tc>
           <w:tcPr>
             <w:tcBorders>
-              <w:left w:val="nil"/>
-              <w:right w:val="nil"/>
-              <w:top w:val="nil"/>
+              <w:left w:val="single" w:sz="4" w:color="D9E1E8"/>
+              <w:right w:val="single" w:sz="4" w:color="D9E1E8"/>
+              <w:top w:val="single" w:sz="4" w:color="D9E1E8"/>
               <w:bottom w:val="single" w:sz="4" w:color="D9E1E8"/>
             </w:tcBorders>
           </w:tcPr>
@@ -3977,9 +3994,9 @@
         <w:tc>
           <w:tcPr>
             <w:tcBorders>
-              <w:left w:val="nil"/>
-              <w:right w:val="nil"/>
-              <w:top w:val="nil"/>
+              <w:left w:val="single" w:sz="4" w:color="D9E1E8"/>
+              <w:right w:val="single" w:sz="4" w:color="D9E1E8"/>
+              <w:top w:val="single" w:sz="4" w:color="D9E1E8"/>
               <w:bottom w:val="single" w:sz="4" w:color="D9E1E8"/>
             </w:tcBorders>
           </w:tcPr>
@@ -3987,7 +4004,7 @@
             <w:pPr>
               <w:pStyle w:val="Compact"/>
               <w:spacing w:before="0" w:after="20" w:line="240" w:lineRule="auto"/>
-              <w:jc w:val="left"/>
+              <w:jc w:val="center"/>
               <w:keepNext w:val="0"/>
               <w:keepLines/>
               <w:widowControl w:val="1"/>
@@ -4006,9 +4023,9 @@
         <w:tc>
           <w:tcPr>
             <w:tcBorders>
-              <w:left w:val="nil"/>
-              <w:right w:val="nil"/>
-              <w:top w:val="nil"/>
+              <w:left w:val="single" w:sz="4" w:color="D9E1E8"/>
+              <w:right w:val="single" w:sz="4" w:color="D9E1E8"/>
+              <w:top w:val="single" w:sz="4" w:color="D9E1E8"/>
               <w:bottom w:val="single" w:sz="4" w:color="D9E1E8"/>
             </w:tcBorders>
           </w:tcPr>
@@ -4033,9 +4050,9 @@
         <w:tc>
           <w:tcPr>
             <w:tcBorders>
-              <w:left w:val="nil"/>
-              <w:right w:val="nil"/>
-              <w:top w:val="nil"/>
+              <w:left w:val="single" w:sz="4" w:color="D9E1E8"/>
+              <w:right w:val="single" w:sz="4" w:color="D9E1E8"/>
+              <w:top w:val="single" w:sz="4" w:color="D9E1E8"/>
               <w:bottom w:val="single" w:sz="4" w:color="D9E1E8"/>
             </w:tcBorders>
           </w:tcPr>
@@ -4043,7 +4060,7 @@
             <w:pPr>
               <w:pStyle w:val="Compact"/>
               <w:spacing w:before="0" w:after="20" w:line="240" w:lineRule="auto"/>
-              <w:jc w:val="left"/>
+              <w:jc w:val="center"/>
               <w:keepNext w:val="0"/>
               <w:keepLines/>
               <w:widowControl w:val="1"/>
@@ -4062,9 +4079,9 @@
         <w:tc>
           <w:tcPr>
             <w:tcBorders>
-              <w:left w:val="nil"/>
-              <w:right w:val="nil"/>
-              <w:top w:val="nil"/>
+              <w:left w:val="single" w:sz="4" w:color="D9E1E8"/>
+              <w:right w:val="single" w:sz="4" w:color="D9E1E8"/>
+              <w:top w:val="single" w:sz="4" w:color="D9E1E8"/>
               <w:bottom w:val="single" w:sz="4" w:color="D9E1E8"/>
             </w:tcBorders>
           </w:tcPr>
@@ -4089,9 +4106,9 @@
         <w:tc>
           <w:tcPr>
             <w:tcBorders>
-              <w:left w:val="nil"/>
-              <w:right w:val="nil"/>
-              <w:top w:val="nil"/>
+              <w:left w:val="single" w:sz="4" w:color="D9E1E8"/>
+              <w:right w:val="single" w:sz="4" w:color="D9E1E8"/>
+              <w:top w:val="single" w:sz="4" w:color="D9E1E8"/>
               <w:bottom w:val="single" w:sz="4" w:color="D9E1E8"/>
             </w:tcBorders>
           </w:tcPr>
@@ -4099,7 +4116,7 @@
             <w:pPr>
               <w:pStyle w:val="Compact"/>
               <w:spacing w:before="0" w:after="20" w:line="240" w:lineRule="auto"/>
-              <w:jc w:val="left"/>
+              <w:jc w:val="center"/>
               <w:keepNext w:val="0"/>
               <w:keepLines/>
               <w:widowControl w:val="1"/>
@@ -4118,9 +4135,9 @@
         <w:tc>
           <w:tcPr>
             <w:tcBorders>
-              <w:left w:val="nil"/>
-              <w:right w:val="nil"/>
-              <w:top w:val="nil"/>
+              <w:left w:val="single" w:sz="4" w:color="D9E1E8"/>
+              <w:right w:val="single" w:sz="4" w:color="D9E1E8"/>
+              <w:top w:val="single" w:sz="4" w:color="D9E1E8"/>
               <w:bottom w:val="single" w:sz="4" w:color="D9E1E8"/>
             </w:tcBorders>
           </w:tcPr>
@@ -4145,9 +4162,9 @@
         <w:tc>
           <w:tcPr>
             <w:tcBorders>
-              <w:left w:val="nil"/>
-              <w:right w:val="nil"/>
-              <w:top w:val="nil"/>
+              <w:left w:val="single" w:sz="4" w:color="D9E1E8"/>
+              <w:right w:val="single" w:sz="4" w:color="D9E1E8"/>
+              <w:top w:val="single" w:sz="4" w:color="D9E1E8"/>
               <w:bottom w:val="single" w:sz="4" w:color="D9E1E8"/>
             </w:tcBorders>
           </w:tcPr>
@@ -4155,7 +4172,7 @@
             <w:pPr>
               <w:pStyle w:val="Compact"/>
               <w:spacing w:before="0" w:after="20" w:line="240" w:lineRule="auto"/>
-              <w:jc w:val="left"/>
+              <w:jc w:val="center"/>
               <w:keepNext w:val="0"/>
               <w:keepLines/>
               <w:widowControl w:val="1"/>
@@ -4174,9 +4191,9 @@
         <w:tc>
           <w:tcPr>
             <w:tcBorders>
-              <w:left w:val="nil"/>
-              <w:right w:val="nil"/>
-              <w:top w:val="nil"/>
+              <w:left w:val="single" w:sz="4" w:color="D9E1E8"/>
+              <w:right w:val="single" w:sz="4" w:color="D9E1E8"/>
+              <w:top w:val="single" w:sz="4" w:color="D9E1E8"/>
               <w:bottom w:val="single" w:sz="4" w:color="D9E1E8"/>
             </w:tcBorders>
           </w:tcPr>
@@ -4201,9 +4218,9 @@
         <w:tc>
           <w:tcPr>
             <w:tcBorders>
-              <w:left w:val="nil"/>
-              <w:right w:val="nil"/>
-              <w:top w:val="nil"/>
+              <w:left w:val="single" w:sz="4" w:color="D9E1E8"/>
+              <w:right w:val="single" w:sz="4" w:color="D9E1E8"/>
+              <w:top w:val="single" w:sz="4" w:color="D9E1E8"/>
               <w:bottom w:val="single" w:sz="4" w:color="D9E1E8"/>
             </w:tcBorders>
           </w:tcPr>
@@ -4211,7 +4228,7 @@
             <w:pPr>
               <w:pStyle w:val="Compact"/>
               <w:spacing w:before="0" w:after="20" w:line="240" w:lineRule="auto"/>
-              <w:jc w:val="left"/>
+              <w:jc w:val="center"/>
               <w:keepNext w:val="0"/>
               <w:keepLines/>
               <w:widowControl w:val="1"/>
@@ -4230,9 +4247,9 @@
         <w:tc>
           <w:tcPr>
             <w:tcBorders>
-              <w:left w:val="nil"/>
-              <w:right w:val="nil"/>
-              <w:top w:val="nil"/>
+              <w:left w:val="single" w:sz="4" w:color="D9E1E8"/>
+              <w:right w:val="single" w:sz="4" w:color="D9E1E8"/>
+              <w:top w:val="single" w:sz="4" w:color="D9E1E8"/>
               <w:bottom w:val="single" w:sz="4" w:color="D9E1E8"/>
             </w:tcBorders>
           </w:tcPr>
@@ -4257,9 +4274,9 @@
         <w:tc>
           <w:tcPr>
             <w:tcBorders>
-              <w:left w:val="nil"/>
-              <w:right w:val="nil"/>
-              <w:top w:val="nil"/>
+              <w:left w:val="single" w:sz="4" w:color="D9E1E8"/>
+              <w:right w:val="single" w:sz="4" w:color="D9E1E8"/>
+              <w:top w:val="single" w:sz="4" w:color="D9E1E8"/>
               <w:bottom w:val="single" w:sz="4" w:color="D9E1E8"/>
             </w:tcBorders>
           </w:tcPr>
@@ -4267,7 +4284,7 @@
             <w:pPr>
               <w:pStyle w:val="Compact"/>
               <w:spacing w:before="0" w:after="20" w:line="240" w:lineRule="auto"/>
-              <w:jc w:val="left"/>
+              <w:jc w:val="center"/>
               <w:keepNext w:val="0"/>
               <w:keepLines/>
               <w:widowControl w:val="1"/>
@@ -4286,9 +4303,9 @@
         <w:tc>
           <w:tcPr>
             <w:tcBorders>
-              <w:left w:val="nil"/>
-              <w:right w:val="nil"/>
-              <w:top w:val="nil"/>
+              <w:left w:val="single" w:sz="4" w:color="D9E1E8"/>
+              <w:right w:val="single" w:sz="4" w:color="D9E1E8"/>
+              <w:top w:val="single" w:sz="4" w:color="D9E1E8"/>
               <w:bottom w:val="nil"/>
             </w:tcBorders>
           </w:tcPr>
@@ -4313,9 +4330,9 @@
         <w:tc>
           <w:tcPr>
             <w:tcBorders>
-              <w:left w:val="nil"/>
-              <w:right w:val="nil"/>
-              <w:top w:val="nil"/>
+              <w:left w:val="single" w:sz="4" w:color="D9E1E8"/>
+              <w:right w:val="single" w:sz="4" w:color="D9E1E8"/>
+              <w:top w:val="single" w:sz="4" w:color="D9E1E8"/>
               <w:bottom w:val="nil"/>
             </w:tcBorders>
           </w:tcPr>
@@ -4323,7 +4340,7 @@
             <w:pPr>
               <w:pStyle w:val="Compact"/>
               <w:spacing w:before="0" w:after="20" w:line="240" w:lineRule="auto"/>
-              <w:jc w:val="left"/>
+              <w:jc w:val="center"/>
               <w:keepNext w:val="0"/>
               <w:keepLines/>
               <w:widowControl w:val="1"/>
@@ -4366,14 +4383,31 @@
     </w:p>
     <w:p>
       <w:pPr>
-        <w:pStyle w:val="TableCaption"/>
-        <w:jc w:val="left"/>
+        <w:spacing w:before="160" w:after="60" w:line="240" w:lineRule="auto"/>
         <w:keepNext/>
         <w:keepLines/>
         <w:widowControl w:val="1"/>
       </w:pPr>
       <w:r>
-        <w:t xml:space="preserve">Table 2: Example item annotations and open-to-multiple-choice conversion examples.</w:t>
+        <w:rPr>
+          <w:b/>
+          <w:i/>
+        </w:rPr>
+        <w:t>Table 2:</w:t>
+      </w:r>
+      <w:r>
+        <w:rPr>
+          <w:b w:val="0"/>
+          <w:i/>
+        </w:rPr>
+        <w:t xml:space="preserve"> </w:t>
+      </w:r>
+      <w:r>
+        <w:rPr>
+          <w:b w:val="0"/>
+          <w:i/>
+        </w:rPr>
+        <w:t>Example item annotations and open-to-multiple-choice conversion examples.</w:t>
       </w:r>
     </w:p>
     <w:tbl>
@@ -4387,10 +4421,10 @@
         <w:tblBorders>
           <w:top w:val="single" w:sz="10" w:color="4F6272"/>
           <w:bottom w:val="single" w:sz="10" w:color="4F6272"/>
-          <w:insideH w:val="single" w:sz="4" w:color="D9E1E8"/>
-          <w:left w:val="nil"/>
-          <w:right w:val="nil"/>
-          <w:insideV w:val="nil"/>
+          <w:insideH w:val="single" w:sz="5" w:color="9FB0C2"/>
+          <w:left w:val="single" w:sz="6" w:color="9FB0C2"/>
+          <w:right w:val="single" w:sz="6" w:color="9FB0C2"/>
+          <w:insideV w:val="single" w:sz="5" w:color="D9E1E8"/>
         </w:tblBorders>
       </w:tblPr>
       <w:tblGrid>
@@ -4407,9 +4441,9 @@
           <w:tcPr>
             <w:shd w:fill="EEF3F7"/>
             <w:tcBorders>
-              <w:left w:val="nil"/>
-              <w:right w:val="nil"/>
-              <w:top w:val="nil"/>
+              <w:left w:val="single" w:sz="4" w:color="D9E1E8"/>
+              <w:right w:val="single" w:sz="4" w:color="D9E1E8"/>
+              <w:top w:val="single" w:sz="4" w:color="D9E1E8"/>
               <w:bottom w:val="single" w:sz="8" w:color="9FB0C2"/>
             </w:tcBorders>
           </w:tcPr>
@@ -4436,9 +4470,9 @@
           <w:tcPr>
             <w:shd w:fill="EEF3F7"/>
             <w:tcBorders>
-              <w:left w:val="nil"/>
-              <w:right w:val="nil"/>
-              <w:top w:val="nil"/>
+              <w:left w:val="single" w:sz="4" w:color="D9E1E8"/>
+              <w:right w:val="single" w:sz="4" w:color="D9E1E8"/>
+              <w:top w:val="single" w:sz="4" w:color="D9E1E8"/>
               <w:bottom w:val="single" w:sz="8" w:color="9FB0C2"/>
             </w:tcBorders>
           </w:tcPr>
@@ -4446,7 +4480,7 @@
             <w:pPr>
               <w:pStyle w:val="Compact"/>
               <w:spacing w:before="0" w:after="20" w:line="240" w:lineRule="auto"/>
-              <w:jc w:val="left"/>
+              <w:jc w:val="center"/>
               <w:keepNext w:val="0"/>
               <w:keepLines/>
               <w:widowControl w:val="1"/>
@@ -4465,9 +4499,9 @@
           <w:tcPr>
             <w:shd w:fill="EEF3F7"/>
             <w:tcBorders>
-              <w:left w:val="nil"/>
-              <w:right w:val="nil"/>
-              <w:top w:val="nil"/>
+              <w:left w:val="single" w:sz="4" w:color="D9E1E8"/>
+              <w:right w:val="single" w:sz="4" w:color="D9E1E8"/>
+              <w:top w:val="single" w:sz="4" w:color="D9E1E8"/>
               <w:bottom w:val="single" w:sz="8" w:color="9FB0C2"/>
             </w:tcBorders>
           </w:tcPr>
@@ -4475,7 +4509,7 @@
             <w:pPr>
               <w:pStyle w:val="Compact"/>
               <w:spacing w:before="0" w:after="20" w:line="240" w:lineRule="auto"/>
-              <w:jc w:val="left"/>
+              <w:jc w:val="center"/>
               <w:keepNext w:val="0"/>
               <w:keepLines/>
               <w:widowControl w:val="1"/>
@@ -4494,9 +4528,9 @@
           <w:tcPr>
             <w:shd w:fill="EEF3F7"/>
             <w:tcBorders>
-              <w:left w:val="nil"/>
-              <w:right w:val="nil"/>
-              <w:top w:val="nil"/>
+              <w:left w:val="single" w:sz="4" w:color="D9E1E8"/>
+              <w:right w:val="single" w:sz="4" w:color="D9E1E8"/>
+              <w:top w:val="single" w:sz="4" w:color="D9E1E8"/>
               <w:bottom w:val="single" w:sz="8" w:color="9FB0C2"/>
             </w:tcBorders>
           </w:tcPr>
@@ -4504,7 +4538,7 @@
             <w:pPr>
               <w:pStyle w:val="Compact"/>
               <w:spacing w:before="0" w:after="20" w:line="240" w:lineRule="auto"/>
-              <w:jc w:val="left"/>
+              <w:jc w:val="center"/>
               <w:keepNext w:val="0"/>
               <w:keepLines/>
               <w:widowControl w:val="1"/>
@@ -4524,9 +4558,9 @@
         <w:tc>
           <w:tcPr>
             <w:tcBorders>
-              <w:left w:val="nil"/>
-              <w:right w:val="nil"/>
-              <w:top w:val="nil"/>
+              <w:left w:val="single" w:sz="4" w:color="D9E1E8"/>
+              <w:right w:val="single" w:sz="4" w:color="D9E1E8"/>
+              <w:top w:val="single" w:sz="4" w:color="D9E1E8"/>
               <w:bottom w:val="single" w:sz="4" w:color="D9E1E8"/>
             </w:tcBorders>
           </w:tcPr>
@@ -4551,9 +4585,9 @@
         <w:tc>
           <w:tcPr>
             <w:tcBorders>
-              <w:left w:val="nil"/>
-              <w:right w:val="nil"/>
-              <w:top w:val="nil"/>
+              <w:left w:val="single" w:sz="4" w:color="D9E1E8"/>
+              <w:right w:val="single" w:sz="4" w:color="D9E1E8"/>
+              <w:top w:val="single" w:sz="4" w:color="D9E1E8"/>
               <w:bottom w:val="single" w:sz="4" w:color="D9E1E8"/>
             </w:tcBorders>
           </w:tcPr>
@@ -4561,7 +4595,7 @@
             <w:pPr>
               <w:pStyle w:val="Compact"/>
               <w:spacing w:before="0" w:after="20" w:line="240" w:lineRule="auto"/>
-              <w:jc w:val="left"/>
+              <w:jc w:val="center"/>
               <w:keepNext w:val="0"/>
               <w:keepLines/>
               <w:widowControl w:val="1"/>
@@ -4578,9 +4612,9 @@
         <w:tc>
           <w:tcPr>
             <w:tcBorders>
-              <w:left w:val="nil"/>
-              <w:right w:val="nil"/>
-              <w:top w:val="nil"/>
+              <w:left w:val="single" w:sz="4" w:color="D9E1E8"/>
+              <w:right w:val="single" w:sz="4" w:color="D9E1E8"/>
+              <w:top w:val="single" w:sz="4" w:color="D9E1E8"/>
               <w:bottom w:val="single" w:sz="4" w:color="D9E1E8"/>
             </w:tcBorders>
           </w:tcPr>
@@ -4588,7 +4622,7 @@
             <w:pPr>
               <w:pStyle w:val="Compact"/>
               <w:spacing w:before="0" w:after="20" w:line="240" w:lineRule="auto"/>
-              <w:jc w:val="left"/>
+              <w:jc w:val="center"/>
               <w:keepNext w:val="0"/>
               <w:keepLines/>
               <w:widowControl w:val="1"/>
@@ -4605,9 +4639,9 @@
         <w:tc>
           <w:tcPr>
             <w:tcBorders>
-              <w:left w:val="nil"/>
-              <w:right w:val="nil"/>
-              <w:top w:val="nil"/>
+              <w:left w:val="single" w:sz="4" w:color="D9E1E8"/>
+              <w:right w:val="single" w:sz="4" w:color="D9E1E8"/>
+              <w:top w:val="single" w:sz="4" w:color="D9E1E8"/>
               <w:bottom w:val="single" w:sz="4" w:color="D9E1E8"/>
             </w:tcBorders>
           </w:tcPr>
@@ -4615,7 +4649,7 @@
             <w:pPr>
               <w:pStyle w:val="Compact"/>
               <w:spacing w:before="0" w:after="20" w:line="240" w:lineRule="auto"/>
-              <w:jc w:val="left"/>
+              <w:jc w:val="center"/>
               <w:keepNext w:val="0"/>
               <w:keepLines/>
               <w:widowControl w:val="1"/>
@@ -4634,9 +4668,9 @@
         <w:tc>
           <w:tcPr>
             <w:tcBorders>
-              <w:left w:val="nil"/>
-              <w:right w:val="nil"/>
-              <w:top w:val="nil"/>
+              <w:left w:val="single" w:sz="4" w:color="D9E1E8"/>
+              <w:right w:val="single" w:sz="4" w:color="D9E1E8"/>
+              <w:top w:val="single" w:sz="4" w:color="D9E1E8"/>
               <w:bottom w:val="single" w:sz="4" w:color="D9E1E8"/>
             </w:tcBorders>
           </w:tcPr>
@@ -4661,9 +4695,9 @@
         <w:tc>
           <w:tcPr>
             <w:tcBorders>
-              <w:left w:val="nil"/>
-              <w:right w:val="nil"/>
-              <w:top w:val="nil"/>
+              <w:left w:val="single" w:sz="4" w:color="D9E1E8"/>
+              <w:right w:val="single" w:sz="4" w:color="D9E1E8"/>
+              <w:top w:val="single" w:sz="4" w:color="D9E1E8"/>
               <w:bottom w:val="single" w:sz="4" w:color="D9E1E8"/>
             </w:tcBorders>
           </w:tcPr>
@@ -4671,7 +4705,7 @@
             <w:pPr>
               <w:pStyle w:val="Compact"/>
               <w:spacing w:before="0" w:after="20" w:line="240" w:lineRule="auto"/>
-              <w:jc w:val="left"/>
+              <w:jc w:val="center"/>
               <w:keepNext w:val="0"/>
               <w:keepLines/>
               <w:widowControl w:val="1"/>
@@ -4688,9 +4722,9 @@
         <w:tc>
           <w:tcPr>
             <w:tcBorders>
-              <w:left w:val="nil"/>
-              <w:right w:val="nil"/>
-              <w:top w:val="nil"/>
+              <w:left w:val="single" w:sz="4" w:color="D9E1E8"/>
+              <w:right w:val="single" w:sz="4" w:color="D9E1E8"/>
+              <w:top w:val="single" w:sz="4" w:color="D9E1E8"/>
               <w:bottom w:val="single" w:sz="4" w:color="D9E1E8"/>
             </w:tcBorders>
           </w:tcPr>
@@ -4698,7 +4732,7 @@
             <w:pPr>
               <w:pStyle w:val="Compact"/>
               <w:spacing w:before="0" w:after="20" w:line="240" w:lineRule="auto"/>
-              <w:jc w:val="left"/>
+              <w:jc w:val="center"/>
               <w:keepNext w:val="0"/>
               <w:keepLines/>
               <w:widowControl w:val="1"/>
@@ -4767,9 +4801,9 @@
         <w:tc>
           <w:tcPr>
             <w:tcBorders>
-              <w:left w:val="nil"/>
-              <w:right w:val="nil"/>
-              <w:top w:val="nil"/>
+              <w:left w:val="single" w:sz="4" w:color="D9E1E8"/>
+              <w:right w:val="single" w:sz="4" w:color="D9E1E8"/>
+              <w:top w:val="single" w:sz="4" w:color="D9E1E8"/>
               <w:bottom w:val="single" w:sz="4" w:color="D9E1E8"/>
             </w:tcBorders>
           </w:tcPr>
@@ -4777,7 +4811,7 @@
             <w:pPr>
               <w:pStyle w:val="Compact"/>
               <w:spacing w:before="0" w:after="20" w:line="240" w:lineRule="auto"/>
-              <w:jc w:val="left"/>
+              <w:jc w:val="center"/>
               <w:keepNext w:val="0"/>
               <w:keepLines/>
               <w:widowControl w:val="1"/>
@@ -4934,9 +4968,9 @@
         <w:tc>
           <w:tcPr>
             <w:tcBorders>
-              <w:left w:val="nil"/>
-              <w:right w:val="nil"/>
-              <w:top w:val="nil"/>
+              <w:left w:val="single" w:sz="4" w:color="D9E1E8"/>
+              <w:right w:val="single" w:sz="4" w:color="D9E1E8"/>
+              <w:top w:val="single" w:sz="4" w:color="D9E1E8"/>
               <w:bottom w:val="nil"/>
             </w:tcBorders>
           </w:tcPr>
@@ -4961,9 +4995,9 @@
         <w:tc>
           <w:tcPr>
             <w:tcBorders>
-              <w:left w:val="nil"/>
-              <w:right w:val="nil"/>
-              <w:top w:val="nil"/>
+              <w:left w:val="single" w:sz="4" w:color="D9E1E8"/>
+              <w:right w:val="single" w:sz="4" w:color="D9E1E8"/>
+              <w:top w:val="single" w:sz="4" w:color="D9E1E8"/>
               <w:bottom w:val="nil"/>
             </w:tcBorders>
           </w:tcPr>
@@ -4971,7 +5005,7 @@
             <w:pPr>
               <w:pStyle w:val="Compact"/>
               <w:spacing w:before="0" w:after="20" w:line="240" w:lineRule="auto"/>
-              <w:jc w:val="left"/>
+              <w:jc w:val="center"/>
               <w:keepNext w:val="0"/>
               <w:keepLines/>
               <w:widowControl w:val="1"/>
@@ -4988,9 +5022,9 @@
         <w:tc>
           <w:tcPr>
             <w:tcBorders>
-              <w:left w:val="nil"/>
-              <w:right w:val="nil"/>
-              <w:top w:val="nil"/>
+              <w:left w:val="single" w:sz="4" w:color="D9E1E8"/>
+              <w:right w:val="single" w:sz="4" w:color="D9E1E8"/>
+              <w:top w:val="single" w:sz="4" w:color="D9E1E8"/>
               <w:bottom w:val="nil"/>
             </w:tcBorders>
           </w:tcPr>
@@ -4998,7 +5032,7 @@
             <w:pPr>
               <w:pStyle w:val="Compact"/>
               <w:spacing w:before="0" w:after="20" w:line="240" w:lineRule="auto"/>
-              <w:jc w:val="left"/>
+              <w:jc w:val="center"/>
               <w:keepNext w:val="0"/>
               <w:keepLines/>
               <w:widowControl w:val="1"/>
@@ -5015,9 +5049,9 @@
         <w:tc>
           <w:tcPr>
             <w:tcBorders>
-              <w:left w:val="nil"/>
-              <w:right w:val="nil"/>
-              <w:top w:val="nil"/>
+              <w:left w:val="single" w:sz="4" w:color="D9E1E8"/>
+              <w:right w:val="single" w:sz="4" w:color="D9E1E8"/>
+              <w:top w:val="single" w:sz="4" w:color="D9E1E8"/>
               <w:bottom w:val="nil"/>
             </w:tcBorders>
           </w:tcPr>
@@ -5025,7 +5059,7 @@
             <w:pPr>
               <w:pStyle w:val="Compact"/>
               <w:spacing w:before="0" w:after="20" w:line="240" w:lineRule="auto"/>
-              <w:jc w:val="left"/>
+              <w:jc w:val="center"/>
               <w:keepNext w:val="0"/>
               <w:keepLines/>
               <w:widowControl w:val="1"/>
@@ -5044,6 +5078,7 @@
     <w:p>
       <w:pPr>
         <w:pStyle w:val="BodyText"/>
+        <w:spacing w:before="160"/>
         <w:jc w:val="both"/>
         <w:keepNext w:val="0"/>
         <w:keepLines w:val="0"/>
@@ -5342,8 +5377,7 @@
     </w:p>
     <w:p>
       <w:pPr>
-        <w:pStyle w:val="ImageCaption"/>
-        <w:jc w:val="left"/>
+        <w:spacing w:before="80" w:after="120" w:line="240" w:lineRule="auto"/>
         <w:keepNext w:val="0"/>
         <w:keepLines/>
         <w:widowControl w:val="1"/>
@@ -5351,107 +5385,23 @@
       <w:r>
         <w:rPr>
           <w:b/>
-          <w:bCs/>
+          <w:i/>
         </w:rPr>
-        <w:t xml:space="preserve">Figure 1:</w:t>
-      </w:r>
-      <w:r>
+        <w:t>Figure 1:</w:t>
+      </w:r>
+      <w:r>
+        <w:rPr>
+          <w:b w:val="0"/>
+          <w:i/>
+        </w:rPr>
         <w:t xml:space="preserve"> </w:t>
       </w:r>
       <w:r>
-        <w:t xml:space="preserve">Controllable Generative Student Architecture. A simulated student is defined by a binary skill vector</w:t>
-      </w:r>
-      <w:r>
-        <w:t xml:space="preserve"> </w:t>
-      </w:r>
-      <m:oMath>
-        <m:r>
-          <m:rPr>
-            <m:sty m:val="bi"/>
-          </m:rPr>
-          <m:t>k</m:t>
-        </m:r>
-        <m:r>
-          <m:rPr>
-            <m:sty m:val="p"/>
-          </m:rPr>
-          <m:t>=</m:t>
-        </m:r>
-        <m:r>
-          <m:rPr>
-            <m:sty m:val="p"/>
-          </m:rPr>
-          <m:t>(</m:t>
-        </m:r>
-        <m:sSub>
-          <m:e>
-            <m:r>
-              <m:t>k</m:t>
-            </m:r>
-          </m:e>
-          <m:sub>
-            <m:r>
-              <m:t>1</m:t>
-            </m:r>
-          </m:sub>
-        </m:sSub>
-        <m:r>
-          <m:rPr>
-            <m:sty m:val="p"/>
-          </m:rPr>
-          <m:t>,</m:t>
-        </m:r>
-        <m:sSub>
-          <m:e>
-            <m:r>
-              <m:t>k</m:t>
-            </m:r>
-          </m:e>
-          <m:sub>
-            <m:r>
-              <m:t>2</m:t>
-            </m:r>
-          </m:sub>
-        </m:sSub>
-        <m:r>
-          <m:rPr>
-            <m:sty m:val="p"/>
-          </m:rPr>
-          <m:t>,</m:t>
-        </m:r>
-        <m:r>
-          <m:rPr>
-            <m:sty m:val="p"/>
-          </m:rPr>
-          <m:t>…</m:t>
-        </m:r>
-        <m:r>
-          <m:rPr>
-            <m:sty m:val="p"/>
-          </m:rPr>
-          <m:t>,</m:t>
-        </m:r>
-        <m:sSub>
-          <m:e>
-            <m:r>
-              <m:t>k</m:t>
-            </m:r>
-          </m:e>
-          <m:sub>
-            <m:r>
-              <m:t>K</m:t>
-            </m:r>
-          </m:sub>
-        </m:sSub>
-        <m:r>
-          <m:rPr>
-            <m:sty m:val="p"/>
-          </m:rPr>
-          <m:t>)</m:t>
-        </m:r>
-      </m:oMath>
-      <w:r>
-        <w:t xml:space="preserve">, where each element corresponds to an evaluated skill. Values of 1 represent retained skills and values of 0 represent intentionally suppressed skills used to simulate knowledge gaps. The vector is translated into retained and missing skill sets and embedded into a structured student profile prompt that conditions the LLM to produce aligned responses.</w:t>
+        <w:rPr>
+          <w:b w:val="0"/>
+          <w:i/>
+        </w:rPr>
+        <w:t>Controllable Generative Student Architecture. A simulated student is defined by a binary skill vector , where each element corresponds to an evaluated skill. Values of 1 represent retained skills and values of 0 represent intentionally suppressed skills used to simulate knowledge gaps. The vector is translated into retained and missing skill sets and embedded into a structured student profile prompt that conditions the LLM to produce aligned responses.</w:t>
       </w:r>
     </w:p>
     <w:p>
@@ -6690,14 +6640,31 @@
     </w:p>
     <w:p>
       <w:pPr>
-        <w:pStyle w:val="TableCaption"/>
-        <w:jc w:val="left"/>
+        <w:spacing w:before="160" w:after="60" w:line="240" w:lineRule="auto"/>
         <w:keepNext/>
         <w:keepLines/>
         <w:widowControl w:val="1"/>
       </w:pPr>
       <w:r>
-        <w:t xml:space="preserve">Table 3: Models evaluated in this study.</w:t>
+        <w:rPr>
+          <w:b/>
+          <w:i/>
+        </w:rPr>
+        <w:t>Table 3:</w:t>
+      </w:r>
+      <w:r>
+        <w:rPr>
+          <w:b w:val="0"/>
+          <w:i/>
+        </w:rPr>
+        <w:t xml:space="preserve"> </w:t>
+      </w:r>
+      <w:r>
+        <w:rPr>
+          <w:b w:val="0"/>
+          <w:i/>
+        </w:rPr>
+        <w:t>Models evaluated in this study.</w:t>
       </w:r>
     </w:p>
     <w:tbl>
@@ -6711,10 +6678,10 @@
         <w:tblBorders>
           <w:top w:val="single" w:sz="10" w:color="4F6272"/>
           <w:bottom w:val="single" w:sz="10" w:color="4F6272"/>
-          <w:insideH w:val="single" w:sz="4" w:color="D9E1E8"/>
-          <w:left w:val="nil"/>
-          <w:right w:val="nil"/>
-          <w:insideV w:val="nil"/>
+          <w:insideH w:val="single" w:sz="5" w:color="9FB0C2"/>
+          <w:left w:val="single" w:sz="6" w:color="9FB0C2"/>
+          <w:right w:val="single" w:sz="6" w:color="9FB0C2"/>
+          <w:insideV w:val="single" w:sz="5" w:color="D9E1E8"/>
         </w:tblBorders>
       </w:tblPr>
       <w:tblGrid>
@@ -6731,9 +6698,9 @@
           <w:tcPr>
             <w:shd w:fill="EEF3F7"/>
             <w:tcBorders>
-              <w:left w:val="nil"/>
-              <w:right w:val="nil"/>
-              <w:top w:val="nil"/>
+              <w:left w:val="single" w:sz="4" w:color="D9E1E8"/>
+              <w:right w:val="single" w:sz="4" w:color="D9E1E8"/>
+              <w:top w:val="single" w:sz="4" w:color="D9E1E8"/>
               <w:bottom w:val="single" w:sz="8" w:color="9FB0C2"/>
             </w:tcBorders>
           </w:tcPr>
@@ -6760,9 +6727,9 @@
           <w:tcPr>
             <w:shd w:fill="EEF3F7"/>
             <w:tcBorders>
-              <w:left w:val="nil"/>
-              <w:right w:val="nil"/>
-              <w:top w:val="nil"/>
+              <w:left w:val="single" w:sz="4" w:color="D9E1E8"/>
+              <w:right w:val="single" w:sz="4" w:color="D9E1E8"/>
+              <w:top w:val="single" w:sz="4" w:color="D9E1E8"/>
               <w:bottom w:val="single" w:sz="8" w:color="9FB0C2"/>
             </w:tcBorders>
           </w:tcPr>
@@ -6770,7 +6737,7 @@
             <w:pPr>
               <w:pStyle w:val="Compact"/>
               <w:spacing w:before="0" w:after="20" w:line="240" w:lineRule="auto"/>
-              <w:jc w:val="left"/>
+              <w:jc w:val="center"/>
               <w:keepNext w:val="0"/>
               <w:keepLines/>
               <w:widowControl w:val="1"/>
@@ -6789,9 +6756,9 @@
           <w:tcPr>
             <w:shd w:fill="EEF3F7"/>
             <w:tcBorders>
-              <w:left w:val="nil"/>
-              <w:right w:val="nil"/>
-              <w:top w:val="nil"/>
+              <w:left w:val="single" w:sz="4" w:color="D9E1E8"/>
+              <w:right w:val="single" w:sz="4" w:color="D9E1E8"/>
+              <w:top w:val="single" w:sz="4" w:color="D9E1E8"/>
               <w:bottom w:val="single" w:sz="8" w:color="9FB0C2"/>
             </w:tcBorders>
           </w:tcPr>
@@ -6799,7 +6766,7 @@
             <w:pPr>
               <w:pStyle w:val="Compact"/>
               <w:spacing w:before="0" w:after="20" w:line="240" w:lineRule="auto"/>
-              <w:jc w:val="left"/>
+              <w:jc w:val="center"/>
               <w:keepNext w:val="0"/>
               <w:keepLines/>
               <w:widowControl w:val="1"/>
@@ -6818,9 +6785,9 @@
           <w:tcPr>
             <w:shd w:fill="EEF3F7"/>
             <w:tcBorders>
-              <w:left w:val="nil"/>
-              <w:right w:val="nil"/>
-              <w:top w:val="nil"/>
+              <w:left w:val="single" w:sz="4" w:color="D9E1E8"/>
+              <w:right w:val="single" w:sz="4" w:color="D9E1E8"/>
+              <w:top w:val="single" w:sz="4" w:color="D9E1E8"/>
               <w:bottom w:val="single" w:sz="8" w:color="9FB0C2"/>
             </w:tcBorders>
           </w:tcPr>
@@ -6828,7 +6795,7 @@
             <w:pPr>
               <w:pStyle w:val="Compact"/>
               <w:spacing w:before="0" w:after="20" w:line="240" w:lineRule="auto"/>
-              <w:jc w:val="left"/>
+              <w:jc w:val="center"/>
               <w:keepNext w:val="0"/>
               <w:keepLines/>
               <w:widowControl w:val="1"/>
@@ -6848,9 +6815,9 @@
         <w:tc>
           <w:tcPr>
             <w:tcBorders>
-              <w:left w:val="nil"/>
-              <w:right w:val="nil"/>
-              <w:top w:val="nil"/>
+              <w:left w:val="single" w:sz="4" w:color="D9E1E8"/>
+              <w:right w:val="single" w:sz="4" w:color="D9E1E8"/>
+              <w:top w:val="single" w:sz="4" w:color="D9E1E8"/>
               <w:bottom w:val="single" w:sz="4" w:color="D9E1E8"/>
             </w:tcBorders>
           </w:tcPr>
@@ -6877,9 +6844,9 @@
         <w:tc>
           <w:tcPr>
             <w:tcBorders>
-              <w:left w:val="nil"/>
-              <w:right w:val="nil"/>
-              <w:top w:val="nil"/>
+              <w:left w:val="single" w:sz="4" w:color="D9E1E8"/>
+              <w:right w:val="single" w:sz="4" w:color="D9E1E8"/>
+              <w:top w:val="single" w:sz="4" w:color="D9E1E8"/>
               <w:bottom w:val="single" w:sz="4" w:color="D9E1E8"/>
             </w:tcBorders>
           </w:tcPr>
@@ -6887,7 +6854,7 @@
             <w:pPr>
               <w:pStyle w:val="Compact"/>
               <w:spacing w:before="0" w:after="20" w:line="240" w:lineRule="auto"/>
-              <w:jc w:val="left"/>
+              <w:jc w:val="center"/>
               <w:keepNext w:val="0"/>
               <w:keepLines/>
               <w:widowControl w:val="1"/>
@@ -6904,9 +6871,9 @@
         <w:tc>
           <w:tcPr>
             <w:tcBorders>
-              <w:left w:val="nil"/>
-              <w:right w:val="nil"/>
-              <w:top w:val="nil"/>
+              <w:left w:val="single" w:sz="4" w:color="D9E1E8"/>
+              <w:right w:val="single" w:sz="4" w:color="D9E1E8"/>
+              <w:top w:val="single" w:sz="4" w:color="D9E1E8"/>
               <w:bottom w:val="single" w:sz="4" w:color="D9E1E8"/>
             </w:tcBorders>
           </w:tcPr>
@@ -6914,7 +6881,7 @@
             <w:pPr>
               <w:pStyle w:val="Compact"/>
               <w:spacing w:before="0" w:after="20" w:line="240" w:lineRule="auto"/>
-              <w:jc w:val="left"/>
+              <w:jc w:val="center"/>
               <w:keepNext w:val="0"/>
               <w:keepLines/>
               <w:widowControl w:val="1"/>
@@ -6931,9 +6898,9 @@
         <w:tc>
           <w:tcPr>
             <w:tcBorders>
-              <w:left w:val="nil"/>
-              <w:right w:val="nil"/>
-              <w:top w:val="nil"/>
+              <w:left w:val="single" w:sz="4" w:color="D9E1E8"/>
+              <w:right w:val="single" w:sz="4" w:color="D9E1E8"/>
+              <w:top w:val="single" w:sz="4" w:color="D9E1E8"/>
               <w:bottom w:val="single" w:sz="4" w:color="D9E1E8"/>
             </w:tcBorders>
           </w:tcPr>
@@ -6941,7 +6908,7 @@
             <w:pPr>
               <w:pStyle w:val="Compact"/>
               <w:spacing w:before="0" w:after="20" w:line="240" w:lineRule="auto"/>
-              <w:jc w:val="left"/>
+              <w:jc w:val="center"/>
               <w:keepNext w:val="0"/>
               <w:keepLines/>
               <w:widowControl w:val="1"/>
@@ -6960,9 +6927,9 @@
         <w:tc>
           <w:tcPr>
             <w:tcBorders>
-              <w:left w:val="nil"/>
-              <w:right w:val="nil"/>
-              <w:top w:val="nil"/>
+              <w:left w:val="single" w:sz="4" w:color="D9E1E8"/>
+              <w:right w:val="single" w:sz="4" w:color="D9E1E8"/>
+              <w:top w:val="single" w:sz="4" w:color="D9E1E8"/>
               <w:bottom w:val="single" w:sz="4" w:color="D9E1E8"/>
             </w:tcBorders>
           </w:tcPr>
@@ -6989,9 +6956,9 @@
         <w:tc>
           <w:tcPr>
             <w:tcBorders>
-              <w:left w:val="nil"/>
-              <w:right w:val="nil"/>
-              <w:top w:val="nil"/>
+              <w:left w:val="single" w:sz="4" w:color="D9E1E8"/>
+              <w:right w:val="single" w:sz="4" w:color="D9E1E8"/>
+              <w:top w:val="single" w:sz="4" w:color="D9E1E8"/>
               <w:bottom w:val="single" w:sz="4" w:color="D9E1E8"/>
             </w:tcBorders>
           </w:tcPr>
@@ -6999,7 +6966,7 @@
             <w:pPr>
               <w:pStyle w:val="Compact"/>
               <w:spacing w:before="0" w:after="20" w:line="240" w:lineRule="auto"/>
-              <w:jc w:val="left"/>
+              <w:jc w:val="center"/>
               <w:keepNext w:val="0"/>
               <w:keepLines/>
               <w:widowControl w:val="1"/>
@@ -7016,9 +6983,9 @@
         <w:tc>
           <w:tcPr>
             <w:tcBorders>
-              <w:left w:val="nil"/>
-              <w:right w:val="nil"/>
-              <w:top w:val="nil"/>
+              <w:left w:val="single" w:sz="4" w:color="D9E1E8"/>
+              <w:right w:val="single" w:sz="4" w:color="D9E1E8"/>
+              <w:top w:val="single" w:sz="4" w:color="D9E1E8"/>
               <w:bottom w:val="single" w:sz="4" w:color="D9E1E8"/>
             </w:tcBorders>
           </w:tcPr>
@@ -7026,7 +6993,7 @@
             <w:pPr>
               <w:pStyle w:val="Compact"/>
               <w:spacing w:before="0" w:after="20" w:line="240" w:lineRule="auto"/>
-              <w:jc w:val="left"/>
+              <w:jc w:val="center"/>
               <w:keepNext w:val="0"/>
               <w:keepLines/>
               <w:widowControl w:val="1"/>
@@ -7043,9 +7010,9 @@
         <w:tc>
           <w:tcPr>
             <w:tcBorders>
-              <w:left w:val="nil"/>
-              <w:right w:val="nil"/>
-              <w:top w:val="nil"/>
+              <w:left w:val="single" w:sz="4" w:color="D9E1E8"/>
+              <w:right w:val="single" w:sz="4" w:color="D9E1E8"/>
+              <w:top w:val="single" w:sz="4" w:color="D9E1E8"/>
               <w:bottom w:val="single" w:sz="4" w:color="D9E1E8"/>
             </w:tcBorders>
           </w:tcPr>
@@ -7053,7 +7020,7 @@
             <w:pPr>
               <w:pStyle w:val="Compact"/>
               <w:spacing w:before="0" w:after="20" w:line="240" w:lineRule="auto"/>
-              <w:jc w:val="left"/>
+              <w:jc w:val="center"/>
               <w:keepNext w:val="0"/>
               <w:keepLines/>
               <w:widowControl w:val="1"/>
@@ -7072,9 +7039,9 @@
         <w:tc>
           <w:tcPr>
             <w:tcBorders>
-              <w:left w:val="nil"/>
-              <w:right w:val="nil"/>
-              <w:top w:val="nil"/>
+              <w:left w:val="single" w:sz="4" w:color="D9E1E8"/>
+              <w:right w:val="single" w:sz="4" w:color="D9E1E8"/>
+              <w:top w:val="single" w:sz="4" w:color="D9E1E8"/>
               <w:bottom w:val="nil"/>
             </w:tcBorders>
           </w:tcPr>
@@ -7101,9 +7068,9 @@
         <w:tc>
           <w:tcPr>
             <w:tcBorders>
-              <w:left w:val="nil"/>
-              <w:right w:val="nil"/>
-              <w:top w:val="nil"/>
+              <w:left w:val="single" w:sz="4" w:color="D9E1E8"/>
+              <w:right w:val="single" w:sz="4" w:color="D9E1E8"/>
+              <w:top w:val="single" w:sz="4" w:color="D9E1E8"/>
               <w:bottom w:val="nil"/>
             </w:tcBorders>
           </w:tcPr>
@@ -7111,7 +7078,7 @@
             <w:pPr>
               <w:pStyle w:val="Compact"/>
               <w:spacing w:before="0" w:after="20" w:line="240" w:lineRule="auto"/>
-              <w:jc w:val="left"/>
+              <w:jc w:val="center"/>
               <w:keepNext w:val="0"/>
               <w:keepLines/>
               <w:widowControl w:val="1"/>
@@ -7128,9 +7095,9 @@
         <w:tc>
           <w:tcPr>
             <w:tcBorders>
-              <w:left w:val="nil"/>
-              <w:right w:val="nil"/>
-              <w:top w:val="nil"/>
+              <w:left w:val="single" w:sz="4" w:color="D9E1E8"/>
+              <w:right w:val="single" w:sz="4" w:color="D9E1E8"/>
+              <w:top w:val="single" w:sz="4" w:color="D9E1E8"/>
               <w:bottom w:val="nil"/>
             </w:tcBorders>
           </w:tcPr>
@@ -7138,7 +7105,7 @@
             <w:pPr>
               <w:pStyle w:val="Compact"/>
               <w:spacing w:before="0" w:after="20" w:line="240" w:lineRule="auto"/>
-              <w:jc w:val="left"/>
+              <w:jc w:val="center"/>
               <w:keepNext w:val="0"/>
               <w:keepLines/>
               <w:widowControl w:val="1"/>
@@ -7155,9 +7122,9 @@
         <w:tc>
           <w:tcPr>
             <w:tcBorders>
-              <w:left w:val="nil"/>
-              <w:right w:val="nil"/>
-              <w:top w:val="nil"/>
+              <w:left w:val="single" w:sz="4" w:color="D9E1E8"/>
+              <w:right w:val="single" w:sz="4" w:color="D9E1E8"/>
+              <w:top w:val="single" w:sz="4" w:color="D9E1E8"/>
               <w:bottom w:val="nil"/>
             </w:tcBorders>
           </w:tcPr>
@@ -7165,7 +7132,7 @@
             <w:pPr>
               <w:pStyle w:val="Compact"/>
               <w:spacing w:before="0" w:after="20" w:line="240" w:lineRule="auto"/>
-              <w:jc w:val="left"/>
+              <w:jc w:val="center"/>
               <w:keepNext w:val="0"/>
               <w:keepLines/>
               <w:widowControl w:val="1"/>
@@ -7184,6 +7151,7 @@
     <w:p>
       <w:pPr>
         <w:pStyle w:val="BodyText"/>
+        <w:spacing w:before="160"/>
         <w:jc w:val="both"/>
         <w:keepNext w:val="0"/>
         <w:keepLines w:val="0"/>
@@ -7842,8 +7810,7 @@
     </w:p>
     <w:p>
       <w:pPr>
-        <w:pStyle w:val="ImageCaption"/>
-        <w:jc w:val="left"/>
+        <w:spacing w:before="80" w:after="120" w:line="240" w:lineRule="auto"/>
         <w:keepNext w:val="0"/>
         <w:keepLines/>
         <w:widowControl w:val="1"/>
@@ -7851,15 +7818,23 @@
       <w:r>
         <w:rPr>
           <w:b/>
-          <w:bCs/>
+          <w:i/>
         </w:rPr>
-        <w:t xml:space="preserve">Figure 2:</w:t>
-      </w:r>
-      <w:r>
+        <w:t>Figure 2:</w:t>
+      </w:r>
+      <w:r>
+        <w:rPr>
+          <w:b w:val="0"/>
+          <w:i/>
+        </w:rPr>
         <w:t xml:space="preserve"> </w:t>
       </w:r>
       <w:r>
-        <w:t xml:space="preserve">Prompting-strategy ablation for Grades 4 and 5. Hybrid prompting dramatically reduces RMSE relative to either instruction-only or example-only prompting, indicating that explicit constraints and demonstrations are both needed to realize the target mastery profile. The dashed line marks a chance-level error reference under a binary target profile.</w:t>
+        <w:rPr>
+          <w:b w:val="0"/>
+          <w:i/>
+        </w:rPr>
+        <w:t>Prompting-strategy ablation for Grades 4 and 5. Hybrid prompting dramatically reduces RMSE relative to either instruction-only or example-only prompting, indicating that explicit constraints and demonstrations are both needed to realize the target mastery profile. The dashed line marks a chance-level error reference under a binary target profile.</w:t>
       </w:r>
     </w:p>
     <w:p>
@@ -7940,8 +7915,7 @@
     </w:p>
     <w:p>
       <w:pPr>
-        <w:pStyle w:val="ImageCaption"/>
-        <w:jc w:val="left"/>
+        <w:spacing w:before="80" w:after="120" w:line="240" w:lineRule="auto"/>
         <w:keepNext w:val="0"/>
         <w:keepLines/>
         <w:widowControl w:val="1"/>
@@ -7949,15 +7923,23 @@
       <w:r>
         <w:rPr>
           <w:b/>
-          <w:bCs/>
+          <w:i/>
         </w:rPr>
-        <w:t xml:space="preserve">Figure 3:</w:t>
-      </w:r>
-      <w:r>
+        <w:t>Figure 3:</w:t>
+      </w:r>
+      <w:r>
+        <w:rPr>
+          <w:b w:val="0"/>
+          <w:i/>
+        </w:rPr>
         <w:t xml:space="preserve"> </w:t>
       </w:r>
       <w:r>
-        <w:t xml:space="preserve">Skill-correlation matrices for the analyzed grades. Off-diagonal correlations remain weak, with Grade 4 clustered around -0.10 and Grade 5 ranging from -0.10 to -0.24. This supports the calibration assumption that targeted suppression can remain mostly localized rather than inducing broad failure across the skill set.</w:t>
+        <w:rPr>
+          <w:b w:val="0"/>
+          <w:i/>
+        </w:rPr>
+        <w:t>Skill-correlation matrices for the analyzed grades. Off-diagonal correlations remain weak, with Grade 4 clustered around -0.10 and Grade 5 ranging from -0.10 to -0.24. This supports the calibration assumption that targeted suppression can remain mostly localized rather than inducing broad failure across the skill set.</w:t>
       </w:r>
     </w:p>
     <w:p>
@@ -8025,8 +8007,7 @@
     </w:p>
     <w:p>
       <w:pPr>
-        <w:pStyle w:val="ImageCaption"/>
-        <w:jc w:val="left"/>
+        <w:spacing w:before="80" w:after="120" w:line="240" w:lineRule="auto"/>
         <w:keepNext w:val="0"/>
         <w:keepLines/>
         <w:widowControl w:val="1"/>
@@ -8034,15 +8015,23 @@
       <w:r>
         <w:rPr>
           <w:b/>
-          <w:bCs/>
+          <w:i/>
         </w:rPr>
-        <w:t xml:space="preserve">Figure 4:</w:t>
-      </w:r>
-      <w:r>
+        <w:t>Figure 4:</w:t>
+      </w:r>
+      <w:r>
+        <w:rPr>
+          <w:b w:val="0"/>
+          <w:i/>
+        </w:rPr>
         <w:t xml:space="preserve"> </w:t>
       </w:r>
       <w:r>
-        <w:t xml:space="preserve">Prediction score by model and grade, defined as actual minus expected retained-skill accuracy. Values near zero indicate close agreement with the calibration target, positive values indicate stronger-than-expected retained-skill preservation, and negative values indicate unintended degradation.</w:t>
+        <w:rPr>
+          <w:b w:val="0"/>
+          <w:i/>
+        </w:rPr>
+        <w:t>Prediction score by model and grade, defined as actual minus expected retained-skill accuracy. Values near zero indicate close agreement with the calibration target, positive values indicate stronger-than-expected retained-skill preservation, and negative values indicate unintended degradation.</w:t>
       </w:r>
     </w:p>
     <w:p>
@@ -8123,8 +8112,7 @@
     </w:p>
     <w:p>
       <w:pPr>
-        <w:pStyle w:val="ImageCaption"/>
-        <w:jc w:val="left"/>
+        <w:spacing w:before="80" w:after="120" w:line="240" w:lineRule="auto"/>
         <w:keepNext w:val="0"/>
         <w:keepLines/>
         <w:widowControl w:val="1"/>
@@ -8132,15 +8120,23 @@
       <w:r>
         <w:rPr>
           <w:b/>
-          <w:bCs/>
+          <w:i/>
         </w:rPr>
-        <w:t xml:space="preserve">Figure 5:</w:t>
-      </w:r>
-      <w:r>
+        <w:t>Figure 5:</w:t>
+      </w:r>
+      <w:r>
+        <w:rPr>
+          <w:b w:val="0"/>
+          <w:i/>
+        </w:rPr>
         <w:t xml:space="preserve"> </w:t>
       </w:r>
       <w:r>
-        <w:t xml:space="preserve">Grade-4 case study for Claude showing requested target mastery (top strip) and observed skill accuracy (bottom heatmap) across six representative knowledge-vector configurations. Cells near 1.00 align with retained targets, whereas cells near 0.00 align with forgotten targets. The figure highlights that profile-level control is selective rather than globally degrading.</w:t>
+        <w:rPr>
+          <w:b w:val="0"/>
+          <w:i/>
+        </w:rPr>
+        <w:t>Grade-4 case study for Claude showing requested target mastery (top strip) and observed skill accuracy (bottom heatmap) across six representative knowledge-vector configurations. Cells near 1.00 align with retained targets, whereas cells near 0.00 align with forgotten targets. The figure highlights that profile-level control is selective rather than globally degrading.</w:t>
       </w:r>
     </w:p>
     <w:p>
@@ -8221,8 +8217,7 @@
     </w:p>
     <w:p>
       <w:pPr>
-        <w:pStyle w:val="ImageCaption"/>
-        <w:jc w:val="left"/>
+        <w:spacing w:before="80" w:after="120" w:line="240" w:lineRule="auto"/>
         <w:keepNext w:val="0"/>
         <w:keepLines/>
         <w:widowControl w:val="1"/>
@@ -8230,15 +8225,23 @@
       <w:r>
         <w:rPr>
           <w:b/>
-          <w:bCs/>
+          <w:i/>
         </w:rPr>
-        <w:t xml:space="preserve">Figure 6:</w:t>
-      </w:r>
-      <w:r>
+        <w:t>Figure 6:</w:t>
+      </w:r>
+      <w:r>
+        <w:rPr>
+          <w:b w:val="0"/>
+          <w:i/>
+        </w:rPr>
         <w:t xml:space="preserve"> </w:t>
       </w:r>
       <w:r>
-        <w:t xml:space="preserve">Forgotten-skill accuracy by model and domain. Lower values indicate stronger suppression when a skill is designated as missing in the target profile. Claude consistently occupies the lowest range, whereas DeepSeek retains substantial residual performance and GPT-4o shows a mixed pattern that depends on the skill family.</w:t>
+        <w:rPr>
+          <w:b w:val="0"/>
+          <w:i/>
+        </w:rPr>
+        <w:t>Forgotten-skill accuracy by model and domain. Lower values indicate stronger suppression when a skill is designated as missing in the target profile. Claude consistently occupies the lowest range, whereas DeepSeek retains substantial residual performance and GPT-4o shows a mixed pattern that depends on the skill family.</w:t>
       </w:r>
     </w:p>
     <w:p>
@@ -8319,8 +8322,7 @@
     </w:p>
     <w:p>
       <w:pPr>
-        <w:pStyle w:val="ImageCaption"/>
-        <w:jc w:val="left"/>
+        <w:spacing w:before="80" w:after="120" w:line="240" w:lineRule="auto"/>
         <w:keepNext w:val="0"/>
         <w:keepLines/>
         <w:widowControl w:val="1"/>
@@ -8328,15 +8330,23 @@
       <w:r>
         <w:rPr>
           <w:b/>
-          <w:bCs/>
+          <w:i/>
         </w:rPr>
-        <w:t xml:space="preserve">Figure 7:</w:t>
-      </w:r>
-      <w:r>
+        <w:t>Figure 7:</w:t>
+      </w:r>
+      <w:r>
+        <w:rPr>
+          <w:b w:val="0"/>
+          <w:i/>
+        </w:rPr>
         <w:t xml:space="preserve"> </w:t>
       </w:r>
       <w:r>
-        <w:t xml:space="preserve">Relative retained-skill and forgotten-skill performance by model for Grades 4 and 5. Values are normalized to each model's perfect-student baseline, and the dashed vertical reference marks 100% of that baseline. Larger gaps indicate stronger selective forgetting with limited collateral damage to retained skills.</w:t>
+        <w:rPr>
+          <w:b w:val="0"/>
+          <w:i/>
+        </w:rPr>
+        <w:t>Relative retained-skill and forgotten-skill performance by model for Grades 4 and 5. Values are normalized to each model's perfect-student baseline, and the dashed vertical reference marks 100% of that baseline. Larger gaps indicate stronger selective forgetting with limited collateral damage to retained skills.</w:t>
       </w:r>
     </w:p>
     <w:p>
@@ -22672,13 +22682,13 @@
     <w:basedOn w:val="BodyText"/>
     <w:pPr>
       <w:keepNext w:val="0"/>
-      <w:spacing w:after="120" w:before="60" w:line="240" w:lineRule="auto"/>
-      <w:jc w:val="left"/>
+      <w:spacing w:after="120" w:before="80" w:line="240" w:lineRule="auto"/>
+      <w:jc w:val="center"/>
     </w:pPr>
     <w:rPr>
       <w:rFonts w:ascii="Times New Roman" w:hAnsi="Times New Roman"/>
       <w:b w:val="0"/>
-      <w:i w:val="0"/>
+      <w:i/>
       <w:sz w:val="19"/>
     </w:rPr>
   </w:style>
@@ -22687,13 +22697,13 @@
     <w:basedOn w:val="BodyText"/>
     <w:pPr>
       <w:keepNext/>
-      <w:spacing w:after="60" w:before="120" w:line="240" w:lineRule="auto"/>
-      <w:jc w:val="left"/>
+      <w:spacing w:after="60" w:before="160" w:line="240" w:lineRule="auto"/>
+      <w:jc w:val="center"/>
     </w:pPr>
     <w:rPr>
       <w:rFonts w:ascii="Times New Roman" w:hAnsi="Times New Roman"/>
       <w:b w:val="0"/>
-      <w:i w:val="0"/>
+      <w:i/>
       <w:sz w:val="19"/>
     </w:rPr>
   </w:style>
@@ -22717,8 +22727,8 @@
     <w:pPr>
       <w:keepNext w:val="0"/>
       <w:spacing w:after="40" w:before="0" w:line="240" w:lineRule="auto"/>
-      <w:ind w:left="346" w:hanging="346"/>
-      <w:jc w:val="left"/>
+      <w:ind w:left="0" w:firstLine="0"/>
+      <w:jc w:val="both"/>
     </w:pPr>
     <w:rPr>
       <w:rFonts w:ascii="Times New Roman" w:hAnsi="Times New Roman"/>

</xml_diff>

<commit_message>
Update manuscript DOCX artifact
</commit_message>
<xml_diff>
--- a/ImperfectStudent_manuscript_v6.docx
+++ b/ImperfectStudent_manuscript_v6.docx
@@ -172,15 +172,7 @@
         <w:pStyle w:val="BodyText"/>
       </w:pPr>
       <w:r>
-        <w:t xml:space="preserve">The results show that selective partial mastery can be induced and measured in a structured mathematics setting, although the degree of controllability remains </w:t>
-      </w:r>
-      <w:proofErr w:type="gramStart"/>
-      <w:r>
-        <w:t>model-dependent</w:t>
-      </w:r>
-      <w:proofErr w:type="gramEnd"/>
-      <w:r>
-        <w:t>. These findings position controllable learner simulation as a distinct research problem at the intersection of teacher education, educational simulation, and language-model control.</w:t>
+        <w:t>The results show that selective partial mastery can be induced and measured in a structured mathematics setting, although the degree of controllability remains model-dependent. These findings position controllable learner simulation as a distinct research problem at the intersection of teacher education, educational simulation, and language-model control.</w:t>
       </w:r>
     </w:p>
     <w:p>
@@ -425,29 +417,13 @@
         <w:t>Fact forgetting</w:t>
       </w:r>
       <w:r>
-        <w:t>, as explored in machine unlearning research (</w:t>
-      </w:r>
-      <w:proofErr w:type="spellStart"/>
-      <w:r>
-        <w:t>Bourtoule</w:t>
-      </w:r>
-      <w:proofErr w:type="spellEnd"/>
-      <w:r>
-        <w:t xml:space="preserve"> et al., 2021), </w:t>
+        <w:t xml:space="preserve">, as explored in machine unlearning research (Bourtoule et al., 2021), </w:t>
       </w:r>
       <w:r>
         <w:t>refers to the removal of discrete factual assertions from a model's</w:t>
       </w:r>
       <w:r>
-        <w:t xml:space="preserve"> behavior. Facts have clear boundaries and unambiguous truth conditions: "Paris is the capital of France" is either asserted or it is not. Evaluating </w:t>
-      </w:r>
-      <w:proofErr w:type="gramStart"/>
-      <w:r>
-        <w:t>fact</w:t>
-      </w:r>
-      <w:proofErr w:type="gramEnd"/>
-      <w:r>
-        <w:t xml:space="preserve"> forgetting is straightforward</w:t>
+        <w:t xml:space="preserve"> behavior. Facts have clear boundaries and unambiguous truth conditions: "Paris is the capital of France" is either asserted or it is not. Evaluating fact forgetting is straightforward</w:t>
       </w:r>
       <w:r>
         <w:t>;</w:t>
@@ -480,31 +456,7 @@
         <w:pStyle w:val="BodyText"/>
       </w:pPr>
       <w:r>
-        <w:t xml:space="preserve">This boundary ambiguity introduces measurement challenges </w:t>
-      </w:r>
-      <w:proofErr w:type="gramStart"/>
-      <w:r>
-        <w:t>that fact</w:t>
-      </w:r>
-      <w:proofErr w:type="gramEnd"/>
-      <w:r>
-        <w:t xml:space="preserve"> forgetting does not face. Skill mastery exists along a continuum, manifesting differently across varied problem types. A student with </w:t>
-      </w:r>
-      <w:proofErr w:type="gramStart"/>
-      <w:r>
-        <w:t>weak fraction</w:t>
-      </w:r>
-      <w:proofErr w:type="gramEnd"/>
-      <w:r>
-        <w:t xml:space="preserve"> knowledge might still solve some fraction problems correctly, depending on problem structure, difficulty, and specific misconceptions. Unlike </w:t>
-      </w:r>
-      <w:proofErr w:type="gramStart"/>
-      <w:r>
-        <w:t>fact forgetting</w:t>
-      </w:r>
-      <w:proofErr w:type="gramEnd"/>
-      <w:r>
-        <w:t>, where complete success means never stating the fact, skill-profile control requires navigating a space of partial and systematic behavior that still reflects the intended knowledge configuration.</w:t>
+        <w:t>This boundary ambiguity introduces measurement challenges that fact forgetting does not face. Skill mastery exists along a continuum, manifesting differently across varied problem types. A student with weak fraction knowledge might still solve some fraction problems correctly, depending on problem structure, difficulty, and specific misconceptions. Unlike fact forgetting, where complete success means never stating the fact, skill-profile control requires navigating a space of partial and systematic behavior that still reflects the intended knowledge configuration.</w:t>
       </w:r>
     </w:p>
     <w:p>
@@ -522,13 +474,8 @@
       <w:bookmarkStart w:id="5" w:name="X38e61191991e50db67e69f5b93d2513ddd73d63"/>
       <w:bookmarkEnd w:id="4"/>
       <w:r>
-        <w:t xml:space="preserve">1.4 Additional Challenges: Why Prompt-Based Control is </w:t>
-      </w:r>
-      <w:proofErr w:type="gramStart"/>
-      <w:r>
-        <w:t>Non-Trivial</w:t>
-      </w:r>
-      <w:proofErr w:type="gramEnd"/>
+        <w:t>1.4 Additional Challenges: Why Prompt-Based Control is Non-Trivial</w:t>
+      </w:r>
     </w:p>
     <w:p>
       <w:pPr>
@@ -709,13 +656,8 @@
         <w:t>A benchmark formulation for partial mastery control</w:t>
       </w:r>
       <w:r>
-        <w:t xml:space="preserve"> based on binary skill vectors that specify retained and forgotten skills </w:t>
-      </w:r>
-      <w:proofErr w:type="gramStart"/>
-      <w:r>
-        <w:t>explicitly;</w:t>
-      </w:r>
-      <w:proofErr w:type="gramEnd"/>
+        <w:t xml:space="preserve"> based on binary skill vectors that specify retained and forgotten skills explicitly;</w:t>
+      </w:r>
     </w:p>
     <w:p>
       <w:pPr>
@@ -733,13 +675,8 @@
         <w:t>A prompt-based student-profile mechanism</w:t>
       </w:r>
       <w:r>
-        <w:t xml:space="preserve"> for testing whether LLM behavior can be steered toward selective retention and </w:t>
-      </w:r>
-      <w:proofErr w:type="gramStart"/>
-      <w:r>
-        <w:t>suppression;</w:t>
-      </w:r>
-      <w:proofErr w:type="gramEnd"/>
+        <w:t xml:space="preserve"> for testing whether LLM behavior can be steered toward selective retention and suppression;</w:t>
+      </w:r>
     </w:p>
     <w:p>
       <w:pPr>
@@ -757,13 +694,8 @@
         <w:t>An evaluation framework</w:t>
       </w:r>
       <w:r>
-        <w:t xml:space="preserve"> combining RMSE, retained-versus-forgotten summaries, and calibration diagnostics to separate controllability from baseline </w:t>
-      </w:r>
-      <w:proofErr w:type="gramStart"/>
-      <w:r>
-        <w:t>capability;</w:t>
-      </w:r>
-      <w:proofErr w:type="gramEnd"/>
+        <w:t xml:space="preserve"> combining RMSE, retained-versus-forgotten summaries, and calibration diagnostics to separate controllability from baseline capability;</w:t>
+      </w:r>
     </w:p>
     <w:p>
       <w:pPr>
@@ -837,15 +769,7 @@
         <w:t>thereby involving encounters with students exhibiting</w:t>
       </w:r>
       <w:r>
-        <w:t xml:space="preserve"> partial mastery, uneven progress, and domain-specific difficulty under conditions that can be revisited and compared. Intelligent tutoring environments such as </w:t>
-      </w:r>
-      <w:proofErr w:type="spellStart"/>
-      <w:r>
-        <w:t>ASSISTments</w:t>
-      </w:r>
-      <w:proofErr w:type="spellEnd"/>
-      <w:r>
-        <w:t xml:space="preserve"> illustrate the broader value of controlled educational interaction platforms, even though they were not designed as LLM-based student simulators (Heffernan &amp; Heffernan, 2014).</w:t>
+        <w:t xml:space="preserve"> partial mastery, uneven progress, and domain-specific difficulty under conditions that can be revisited and compared. Intelligent tutoring environments such as ASSISTments illustrate the broader value of controlled educational interaction platforms, even though they were not designed as LLM-based student simulators (Heffernan &amp; Heffernan, 2014).</w:t>
       </w:r>
     </w:p>
     <w:p>
@@ -909,23 +833,7 @@
         <w:pStyle w:val="BodyText"/>
       </w:pPr>
       <w:r>
-        <w:t xml:space="preserve">Other systems focus on tutoring behavior rather than simulated student controllability. AI2T (Weitekamp et al., 2024), </w:t>
-      </w:r>
-      <w:proofErr w:type="spellStart"/>
-      <w:r>
-        <w:t>SocraticLM</w:t>
-      </w:r>
-      <w:proofErr w:type="spellEnd"/>
-      <w:r>
-        <w:t xml:space="preserve"> (Liu et al., 2024), and tutoring-oriented systems such as </w:t>
-      </w:r>
-      <w:proofErr w:type="spellStart"/>
-      <w:r>
-        <w:t>Scarlatos</w:t>
-      </w:r>
-      <w:proofErr w:type="spellEnd"/>
-      <w:r>
-        <w:t xml:space="preserve"> et al. (2025) and Guevarra et al. (2025) study how LLMs can support instruction, scaffolding, or interaction design. These works are closely </w:t>
+        <w:t xml:space="preserve">Other systems focus on tutoring behavior rather than simulated student controllability. AI2T (Weitekamp et al., 2024), SocraticLM (Liu et al., 2024), and tutoring-oriented systems such as Scarlatos et al. (2025) and Guevarra et al. (2025) study how LLMs can support instruction, scaffolding, or interaction design. These works are closely </w:t>
       </w:r>
       <w:r>
         <w:t>related, but they do not primarily ask whether a model can be forced to preserve certain curricular skills while suppressing others in a tightly defined</w:t>
@@ -968,37 +876,8 @@
       <w:pPr>
         <w:pStyle w:val="FirstParagraph"/>
       </w:pPr>
-      <w:proofErr w:type="gramStart"/>
-      <w:r>
-        <w:t>Persona</w:t>
-      </w:r>
-      <w:proofErr w:type="gramEnd"/>
-      <w:r>
-        <w:t xml:space="preserve"> and behavior-control research is relevant because it studies whether prompted LLMs can maintain non-default behavioral states over extended interactions. </w:t>
-      </w:r>
-      <w:proofErr w:type="spellStart"/>
-      <w:r>
-        <w:t>PersonaLLM</w:t>
-      </w:r>
-      <w:proofErr w:type="spellEnd"/>
-      <w:r>
-        <w:t xml:space="preserve"> (Jiang et al., 2023), </w:t>
-      </w:r>
-      <w:proofErr w:type="spellStart"/>
-      <w:r>
-        <w:t>RoleLLM</w:t>
-      </w:r>
-      <w:proofErr w:type="spellEnd"/>
-      <w:r>
-        <w:t xml:space="preserve"> (Wang et al., 2023), </w:t>
-      </w:r>
-      <w:proofErr w:type="spellStart"/>
-      <w:r>
-        <w:t>PersonaGym</w:t>
-      </w:r>
-      <w:proofErr w:type="spellEnd"/>
-      <w:r>
-        <w:t xml:space="preserve"> (Samuel et al., 2024), and recent role-playing surveys (Tseng et al., 2024) all show that behavioral conditioning is possible but imperfect. Fidelity depends on the model, the target behavior, and the evaluation protocol.</w:t>
+      <w:r>
+        <w:t>Persona and behavior-control research is relevant because it studies whether prompted LLMs can maintain non-default behavioral states over extended interactions. PersonaLLM (Jiang et al., 2023), RoleLLM (Wang et al., 2023), PersonaGym (Samuel et al., 2024), and recent role-playing surveys (Tseng et al., 2024) all show that behavioral conditioning is possible but imperfect. Fidelity depends on the model, the target behavior, and the evaluation protocol.</w:t>
       </w:r>
     </w:p>
     <w:p>
@@ -1006,15 +885,7 @@
         <w:pStyle w:val="BodyText"/>
       </w:pPr>
       <w:r>
-        <w:t xml:space="preserve">Related work also studies how prompts and backstories can stabilize role enactment. Moon et al. (2024) construct virtual personas through curated backstory anthologies, while </w:t>
-      </w:r>
-      <w:proofErr w:type="spellStart"/>
-      <w:r>
-        <w:t>Kadavath</w:t>
-      </w:r>
-      <w:proofErr w:type="spellEnd"/>
-      <w:r>
-        <w:t xml:space="preserve"> et al. (2022) show that LLMs expose metacognitive signals relevant to calibration and self-assessment. More broadly, prompting research treats prompts as a general control surface rather than merely as few-shot examples (Liu et al., 2023), and inference-time steering methods such as PASTA show that stronger behavioral control can also be imposed by directing model attention to user-specified information without parameter updates (Zhang et al., 2024). Prompt-design surveys further suggest that multi-step and iterative prompting can improve control over complex tasks by decomposing constraints across stages (Cohen &amp; Aperstein, 2024). Together, these papers motivate treating persona control, confidence-aware behavior, and prompt structure as useful neighboring problems, even though our target is curricular competence rather than narrative identity.</w:t>
+        <w:t>Related work also studies how prompts and backstories can stabilize role enactment. Moon et al. (2024) construct virtual personas through curated backstory anthologies, while Kadavath et al. (2022) show that LLMs expose metacognitive signals relevant to calibration and self-assessment. More broadly, prompting research treats prompts as a general control surface rather than merely as few-shot examples (Liu et al., 2023), and inference-time steering methods such as PASTA show that stronger behavioral control can also be imposed by directing model attention to user-specified information without parameter updates (Zhang et al., 2024). Prompt-design surveys further suggest that multi-step and iterative prompting can improve control over complex tasks by decomposing constraints across stages (Cohen &amp; Aperstein, 2024). Together, these papers motivate treating persona control, confidence-aware behavior, and prompt structure as useful neighboring problems, even though our target is curricular competence rather than narrative identity.</w:t>
       </w:r>
     </w:p>
     <w:p>
@@ -1044,15 +915,7 @@
       </w:r>
       <w:r>
         <w:lastRenderedPageBreak/>
-        <w:t>(</w:t>
-      </w:r>
-      <w:proofErr w:type="spellStart"/>
-      <w:r>
-        <w:t>Bourtoule</w:t>
-      </w:r>
-      <w:proofErr w:type="spellEnd"/>
-      <w:r>
-        <w:t xml:space="preserve"> et al., 2021; Xu et al., 2023) and more recent LLM-specific methods (Ji et al., 2024; Guo et al., 2024) focus on the forget-retain trade-off and on limiting collateral damage to retained knowledge.</w:t>
+        <w:t>(Bourtoule et al., 2021; Xu et al., 2023) and more recent LLM-specific methods (Ji et al., 2024; Guo et al., 2024) focus on the forget-retain trade-off and on limiting collateral damage to retained knowledge.</w:t>
       </w:r>
     </w:p>
     <w:p>
@@ -1084,31 +947,7 @@
         <w:pStyle w:val="FirstParagraph"/>
       </w:pPr>
       <w:r>
-        <w:t xml:space="preserve">Knowledge tracing and learner modeling provide the closest educational analogue to our notion of a skill profile. Deep Knowledge Tracing (Piech et al., 2015), Dynamic Key-Value Memory Networks (Zhang et al., 2017), and self-attentive tracing (Pandey &amp; </w:t>
-      </w:r>
-      <w:proofErr w:type="spellStart"/>
-      <w:r>
-        <w:t>Karypis</w:t>
-      </w:r>
-      <w:proofErr w:type="spellEnd"/>
-      <w:r>
-        <w:t xml:space="preserve">, 2019) all model learner state over time. </w:t>
-      </w:r>
-      <w:proofErr w:type="spellStart"/>
-      <w:r>
-        <w:t>Gervet</w:t>
-      </w:r>
-      <w:proofErr w:type="spellEnd"/>
-      <w:r>
-        <w:t xml:space="preserve"> et al. (2020) further show that model choice in knowledge tracing depends strongly on data regime and task structure, while </w:t>
-      </w:r>
-      <w:proofErr w:type="spellStart"/>
-      <w:r>
-        <w:t>EdNet</w:t>
-      </w:r>
-      <w:proofErr w:type="spellEnd"/>
-      <w:r>
-        <w:t xml:space="preserve"> (Choi et al., 2020) illustrates the scale and hierarchy that modern learner-modeling datasets can support.</w:t>
+        <w:t>Knowledge tracing and learner modeling provide the closest educational analogue to our notion of a skill profile. Deep Knowledge Tracing (Piech et al., 2015), Dynamic Key-Value Memory Networks (Zhang et al., 2017), and self-attentive tracing (Pandey &amp; Karypis, 2019) all model learner state over time. Gervet et al. (2020) further show that model choice in knowledge tracing depends strongly on data regime and task structure, while EdNet (Choi et al., 2020) illustrates the scale and hierarchy that modern learner-modeling datasets can support.</w:t>
       </w:r>
     </w:p>
     <w:p>
@@ -1176,15 +1015,7 @@
         <w:t>Gap 2: Weak connection between steering literature and curricular skill control.</w:t>
       </w:r>
       <w:r>
-        <w:t xml:space="preserve"> </w:t>
-      </w:r>
-      <w:proofErr w:type="gramStart"/>
-      <w:r>
-        <w:t>Persona</w:t>
-      </w:r>
-      <w:proofErr w:type="gramEnd"/>
-      <w:r>
-        <w:t xml:space="preserve"> and steering studies show that LLM behavior can be nudged, but they do not directly establish whether curricular skills can be suppressed selectively while preserving untargeted competencies.</w:t>
+        <w:t xml:space="preserve"> Persona and steering studies show that LLM behavior can be nudged, but they do not directly establish whether curricular skills can be suppressed selectively while preserving untargeted competencies.</w:t>
       </w:r>
     </w:p>
     <w:p>
@@ -2656,15 +2487,7 @@
         <w:pStyle w:val="FirstParagraph"/>
       </w:pPr>
       <w:r>
-        <w:t xml:space="preserve">Relative loss measures the proportional drop in performance relative to the </w:t>
-      </w:r>
-      <w:proofErr w:type="gramStart"/>
-      <w:r>
-        <w:t>perfect-student</w:t>
-      </w:r>
-      <w:proofErr w:type="gramEnd"/>
-      <w:r>
-        <w:t xml:space="preserve"> baseline:</w:t>
+        <w:t>Relative loss measures the proportional drop in performance relative to the perfect-student baseline:</w:t>
       </w:r>
     </w:p>
     <w:p>
@@ -4399,44 +4222,15 @@
       </w:pPr>
       <w:bookmarkStart w:id="24" w:name="mathcamps"/>
       <w:r>
-        <w:t xml:space="preserve">4.1 </w:t>
-      </w:r>
-      <w:proofErr w:type="spellStart"/>
-      <w:r>
-        <w:t>MathCAMPS</w:t>
-      </w:r>
-      <w:proofErr w:type="spellEnd"/>
+        <w:t>4.1 MathCAMPS</w:t>
+      </w:r>
     </w:p>
     <w:p>
       <w:pPr>
         <w:pStyle w:val="FirstParagraph"/>
       </w:pPr>
       <w:r>
-        <w:t xml:space="preserve">The empirical framework uses </w:t>
-      </w:r>
-      <w:proofErr w:type="spellStart"/>
-      <w:r>
-        <w:t>MathCAMPS</w:t>
-      </w:r>
-      <w:proofErr w:type="spellEnd"/>
-      <w:r>
-        <w:t xml:space="preserve">: curriculum-aligned mathematics problems tagged to U.S. Common Core standards. Each standard </w:t>
-      </w:r>
-      <w:proofErr w:type="gramStart"/>
-      <w:r>
-        <w:t>maps</w:t>
-      </w:r>
-      <w:proofErr w:type="gramEnd"/>
-      <w:r>
-        <w:t xml:space="preserve"> to a domain treated as a distinct skill, enabling direct transformation from standards to skill taxonomy. This approach extends prior educational datasets such as </w:t>
-      </w:r>
-      <w:proofErr w:type="spellStart"/>
-      <w:r>
-        <w:t>EdNet</w:t>
-      </w:r>
-      <w:proofErr w:type="spellEnd"/>
-      <w:r>
-        <w:t xml:space="preserve"> (Choi et al., 2020), which established large-scale hierarchical benchmarks for knowledge tracing in mathematics education.</w:t>
+        <w:t>The empirical framework uses MathCAMPS: curriculum-aligned mathematics problems tagged to U.S. Common Core standards. Each standard maps to a domain treated as a distinct skill, enabling direct transformation from standards to skill taxonomy. This approach extends prior educational datasets such as EdNet (Choi et al., 2020), which established large-scale hierarchical benchmarks for knowledge tracing in mathematics education.</w:t>
       </w:r>
     </w:p>
     <w:p>
@@ -4468,15 +4262,7 @@
         <w:pStyle w:val="FirstParagraph"/>
       </w:pPr>
       <w:r>
-        <w:t xml:space="preserve">The </w:t>
-      </w:r>
-      <w:proofErr w:type="spellStart"/>
-      <w:r>
-        <w:t>MathCAMPS</w:t>
-      </w:r>
-      <w:proofErr w:type="spellEnd"/>
-      <w:r>
-        <w:t xml:space="preserve"> dataset is organized into eight grade-level datasets corresponding to grades 1 through 8. Each grade-specific dataset contains 100 multiple-choice questions balanced across the relevant skill domains for that grade.</w:t>
+        <w:t>The MathCAMPS dataset is organized into eight grade-level datasets corresponding to grades 1 through 8. Each grade-specific dataset contains 100 multiple-choice questions balanced across the relevant skill domains for that grade.</w:t>
       </w:r>
     </w:p>
     <w:p>
@@ -4523,21 +4309,7 @@
         <w:rPr>
           <w:i/>
         </w:rPr>
-        <w:t xml:space="preserve"> Grade-level skill families used to structure </w:t>
-      </w:r>
-      <w:proofErr w:type="spellStart"/>
-      <w:r>
-        <w:rPr>
-          <w:i/>
-        </w:rPr>
-        <w:t>MathCAMPS</w:t>
-      </w:r>
-      <w:proofErr w:type="spellEnd"/>
-      <w:r>
-        <w:rPr>
-          <w:i/>
-        </w:rPr>
-        <w:t>.</w:t>
+        <w:t xml:space="preserve"> Grade-level skill families used to structure MathCAMPS.</w:t>
       </w:r>
     </w:p>
     <w:tbl>
@@ -5714,19 +5486,11 @@
               <w:spacing w:after="20" w:line="240" w:lineRule="auto"/>
               <w:jc w:val="center"/>
             </w:pPr>
-            <w:proofErr w:type="gramStart"/>
             <w:r>
               <w:rPr>
                 <w:sz w:val="20"/>
               </w:rPr>
-              <w:t>A recipe</w:t>
-            </w:r>
-            <w:proofErr w:type="gramEnd"/>
-            <w:r>
-              <w:rPr>
-                <w:sz w:val="20"/>
-              </w:rPr>
-              <w:t xml:space="preserve"> uses 2 cups of flour for 3 batches. How many cups are needed for 9 batches?</w:t>
+              <w:t>A recipe uses 2 cups of flour for 3 batches. How many cups are needed for 9 batches?</w:t>
             </w:r>
           </w:p>
         </w:tc>
@@ -7782,19 +7546,11 @@
               <w:spacing w:after="20" w:line="240" w:lineRule="auto"/>
               <w:jc w:val="center"/>
             </w:pPr>
-            <w:proofErr w:type="gramStart"/>
             <w:r>
               <w:rPr>
                 <w:sz w:val="20"/>
               </w:rPr>
-              <w:t>Represents</w:t>
-            </w:r>
-            <w:proofErr w:type="gramEnd"/>
-            <w:r>
-              <w:rPr>
-                <w:sz w:val="20"/>
-              </w:rPr>
-              <w:t xml:space="preserve"> a high-compliance frontier model family</w:t>
+              <w:t>Represents a high-compliance frontier model family</w:t>
             </w:r>
           </w:p>
         </w:tc>
@@ -8103,15 +7859,7 @@
         <w:pStyle w:val="FirstParagraph"/>
       </w:pPr>
       <w:r>
-        <w:t xml:space="preserve">Each prompt follows a consistent architecture containing: (1) the student's retained and missing skills, (2) behavioral instructions and/or examples, and (3) the multiple-choice question. This prompt </w:t>
-      </w:r>
-      <w:proofErr w:type="gramStart"/>
-      <w:r>
-        <w:t>schema</w:t>
-      </w:r>
-      <w:proofErr w:type="gramEnd"/>
-      <w:r>
-        <w:t xml:space="preserve"> is </w:t>
+        <w:t xml:space="preserve">Each prompt follows a consistent architecture containing: (1) the student's retained and missing skills, (2) behavioral instructions and/or examples, and (3) the multiple-choice question. This prompt schema is </w:t>
       </w:r>
       <w:r>
         <w:lastRenderedPageBreak/>
@@ -8824,7 +8572,13 @@
         <w:pStyle w:val="BodyText"/>
       </w:pPr>
       <w:r>
-        <w:t>We next ask whether the benchmark structure itself permits localized control. Figure 4 shows that cross-skill dependencies remain weak across both analyzed grades. The Grade-4 matrix is nearly uniform away from the diagonal, and even Grade 5 shows only mild negative coupling. In practical terms, the benchmark does not behave as if forgetting one skill automatically drags all other skills down with it. That said, the Grade-5 correlations are somewhat stronger than those in Grade 4, so the paper should frame independence as an empirical tendency in the analyzed setting, not as a guaranteed property of arbitrary skill taxonomies.</w:t>
+        <w:t xml:space="preserve">We next ask whether the benchmark structure itself permits localized control. Figure 4 shows that cross-skill dependencies remain weak across both analyzed grades. The Grade-4 matrix is nearly uniform away from the diagonal, and even Grade 5 shows only mild negative coupling. In practical terms, the benchmark does not behave as if forgetting one skill automatically drags all other skills down with it. That said, the Grade-5 correlations are somewhat stronger than those in Grade 4, so the paper should frame independence as an empirical tendency in the </w:t>
+      </w:r>
+      <w:r>
+        <w:t>setting analyzed, rather than</w:t>
+      </w:r>
+      <w:r>
+        <w:t xml:space="preserve"> a guaranteed property of arbitrary skill taxonomies.</w:t>
       </w:r>
     </w:p>
     <w:p>
@@ -9366,17 +9120,8 @@
           <w:bCs/>
         </w:rPr>
         <w:lastRenderedPageBreak/>
-        <w:t xml:space="preserve">Retention is substantially more stable than </w:t>
-      </w:r>
-      <w:proofErr w:type="gramStart"/>
-      <w:r>
-        <w:rPr>
-          <w:b/>
-          <w:bCs/>
-        </w:rPr>
-        <w:t>forgetting:</w:t>
-      </w:r>
-      <w:proofErr w:type="gramEnd"/>
+        <w:t>Retention is substantially more stable than forgetting:</w:t>
+      </w:r>
       <w:r>
         <w:t xml:space="preserve"> Figure 7 shows large retained-forgotten gaps for all models, with the strongest separation achieved by Claude.</w:t>
       </w:r>
@@ -9485,23 +9230,7 @@
         <w:pStyle w:val="BodyText"/>
       </w:pPr>
       <w:r>
-        <w:t xml:space="preserve">The calibration results </w:t>
-      </w:r>
-      <w:proofErr w:type="gramStart"/>
-      <w:r>
-        <w:t>add</w:t>
-      </w:r>
-      <w:proofErr w:type="gramEnd"/>
-      <w:r>
-        <w:t xml:space="preserve"> a second lesson: weak cross-skill coupling is helpful but not sufficient. Even when the benchmark structure supports </w:t>
-      </w:r>
-      <w:proofErr w:type="gramStart"/>
-      <w:r>
-        <w:t>fairly localized</w:t>
-      </w:r>
-      <w:proofErr w:type="gramEnd"/>
-      <w:r>
-        <w:t xml:space="preserve"> control, models still differ in whether retained skills remain near their expected level. This is why the paper treats prompting quality, retained-skill calibration, and retained-versus-forgotten separation as complementary diagnostics rather than interchangeable ones.</w:t>
+        <w:t>The calibration results add a second lesson: weak cross-skill coupling is helpful but not sufficient. Even when the benchmark structure supports fairly localized control, models still differ in whether retained skills remain near their expected level. This is why the paper treats prompting quality, retained-skill calibration, and retained-versus-forgotten separation as complementary diagnostics rather than interchangeable ones.</w:t>
       </w:r>
     </w:p>
     <w:p>
@@ -9525,15 +9254,7 @@
         <w:t xml:space="preserve">by the correlation analysis, inter-skill correlations are weak in the grades analyzed, </w:t>
       </w:r>
       <w:r>
-        <w:t xml:space="preserve">consistent with </w:t>
-      </w:r>
-      <w:proofErr w:type="gramStart"/>
-      <w:r>
-        <w:t>fairly localized</w:t>
-      </w:r>
-      <w:proofErr w:type="gramEnd"/>
-      <w:r>
-        <w:t xml:space="preserve"> behavioral control. The multivariate calibration framework provides an analytical interpretation of this pattern, but it should be understood as an approximation rather than as a validated cognitive model of student skill performance. Localized control appears feasible in the analyzed grades, yet it should not be assumed to transfer unchanged to larger skill graphs, richer pedagogical tasks, or alternative curricula.</w:t>
+        <w:t>consistent with fairly localized behavioral control. The multivariate calibration framework provides an analytical interpretation of this pattern, but it should be understood as an approximation rather than as a validated cognitive model of student skill performance. Localized control appears feasible in the analyzed grades, yet it should not be assumed to transfer unchanged to larger skill graphs, richer pedagogical tasks, or alternative curricula.</w:t>
       </w:r>
     </w:p>
     <w:p>
@@ -9620,21 +9341,12 @@
           <w:numId w:val="17"/>
         </w:numPr>
       </w:pPr>
-      <w:proofErr w:type="gramStart"/>
       <w:r>
         <w:rPr>
           <w:b/>
           <w:bCs/>
         </w:rPr>
-        <w:t>Single-skill</w:t>
-      </w:r>
-      <w:proofErr w:type="gramEnd"/>
-      <w:r>
-        <w:rPr>
-          <w:b/>
-          <w:bCs/>
-        </w:rPr>
-        <w:t xml:space="preserve"> per question:</w:t>
+        <w:t>Single-skill per question:</w:t>
       </w:r>
       <w:r>
         <w:t xml:space="preserve"> May not reflect real educational content where problems often require multiple skills. Hierarchical skill representations could address this.</w:t>
@@ -9838,23 +9550,7 @@
         <w:pStyle w:val="FirstParagraph"/>
       </w:pPr>
       <w:r>
-        <w:t xml:space="preserve">This paper introduced a benchmark-oriented framework for </w:t>
-      </w:r>
-      <w:proofErr w:type="gramStart"/>
-      <w:r>
-        <w:t>controllable</w:t>
-      </w:r>
-      <w:proofErr w:type="gramEnd"/>
-      <w:r>
-        <w:t xml:space="preserve"> simulation of imperfect students with large language models. By representing student knowledge with explicit binary skill vectors and evaluating behavior at the skill level, the study shows that selective retention and suppression can be measured in a principled way within a mathematics benchmark setting. Across the reported experiments, combined prompting provides the most reliable alignment between the target mastery profile and observed model behavior, although the strength of controllability remains strongly </w:t>
-      </w:r>
-      <w:proofErr w:type="gramStart"/>
-      <w:r>
-        <w:t>model-dependent</w:t>
-      </w:r>
-      <w:proofErr w:type="gramEnd"/>
-      <w:r>
-        <w:t>.</w:t>
+        <w:t>This paper introduced a benchmark-oriented framework for controllable simulation of imperfect students with large language models. By representing student knowledge with explicit binary skill vectors and evaluating behavior at the skill level, the study shows that selective retention and suppression can be measured in a principled way within a mathematics benchmark setting. Across the reported experiments, combined prompting provides the most reliable alignment between the target mastery profile and observed model behavior, although the strength of controllability remains strongly model-dependent.</w:t>
       </w:r>
     </w:p>
     <w:p>
@@ -9939,13 +9635,8 @@
         <w:pStyle w:val="ReferenceEntry"/>
         <w:jc w:val="left"/>
       </w:pPr>
-      <w:proofErr w:type="spellStart"/>
-      <w:r>
-        <w:t>Bourtoule</w:t>
-      </w:r>
-      <w:proofErr w:type="spellEnd"/>
-      <w:r>
-        <w:t xml:space="preserve">, L., et al. (2021). Machine unlearning. In </w:t>
+      <w:r>
+        <w:t xml:space="preserve">Bourtoule, L., et al. (2021). Machine unlearning. In </w:t>
       </w:r>
       <w:r>
         <w:rPr>
@@ -9978,15 +9669,7 @@
         <w:jc w:val="left"/>
       </w:pPr>
       <w:r>
-        <w:t xml:space="preserve">Choi, Y., et al. (2020). </w:t>
-      </w:r>
-      <w:proofErr w:type="spellStart"/>
-      <w:r>
-        <w:t>EdNet</w:t>
-      </w:r>
-      <w:proofErr w:type="spellEnd"/>
-      <w:r>
-        <w:t xml:space="preserve">: A large-scale hierarchical dataset in education. In </w:t>
+        <w:t xml:space="preserve">Choi, Y., et al. (2020). EdNet: A large-scale hierarchical dataset in education. In </w:t>
       </w:r>
       <w:r>
         <w:rPr>
@@ -10067,34 +9750,10 @@
           <w:i/>
           <w:iCs/>
         </w:rPr>
-        <w:t>2023 IEEE International Conference on Big Data (</w:t>
-      </w:r>
-      <w:proofErr w:type="spellStart"/>
-      <w:r>
-        <w:rPr>
-          <w:i/>
-          <w:iCs/>
-        </w:rPr>
-        <w:t>BigData</w:t>
-      </w:r>
-      <w:proofErr w:type="spellEnd"/>
-      <w:r>
-        <w:rPr>
-          <w:i/>
-          <w:iCs/>
-        </w:rPr>
-        <w:t>)</w:t>
-      </w:r>
-      <w:r>
-        <w:t xml:space="preserve"> (</w:t>
-      </w:r>
-      <w:proofErr w:type="gramStart"/>
-      <w:r>
-        <w:t>pp</w:t>
-      </w:r>
-      <w:proofErr w:type="gramEnd"/>
-      <w:r>
-        <w:t xml:space="preserve">. 4776-4785). </w:t>
+        <w:t>2023 IEEE International Conference on Big Data (BigData)</w:t>
+      </w:r>
+      <w:r>
+        <w:t xml:space="preserve"> (pp. 4776-4785). </w:t>
       </w:r>
       <w:hyperlink r:id="rId16">
         <w:r>
@@ -10107,13 +9766,8 @@
         <w:pStyle w:val="ReferenceEntry"/>
         <w:jc w:val="left"/>
       </w:pPr>
-      <w:proofErr w:type="spellStart"/>
-      <w:r>
-        <w:t>Gervet</w:t>
-      </w:r>
-      <w:proofErr w:type="spellEnd"/>
-      <w:r>
-        <w:t xml:space="preserve">, T., Koedinger, K. R., Schneider, J., Mitchell, T. M., &amp; Baker, R. S. (2020). When is deep learning the best approach to knowledge tracing? </w:t>
+      <w:r>
+        <w:t xml:space="preserve">Gervet, T., Koedinger, K. R., Schneider, J., Mitchell, T. M., &amp; Baker, R. S. (2020). When is deep learning the best approach to knowledge tracing? </w:t>
       </w:r>
       <w:r>
         <w:rPr>
@@ -10217,15 +9871,7 @@
         <w:jc w:val="left"/>
       </w:pPr>
       <w:r>
-        <w:t xml:space="preserve">Heffernan, N. T., &amp; Heffernan, C. L. (2014). The </w:t>
-      </w:r>
-      <w:proofErr w:type="spellStart"/>
-      <w:r>
-        <w:t>ASSISTments</w:t>
-      </w:r>
-      <w:proofErr w:type="spellEnd"/>
-      <w:r>
-        <w:t xml:space="preserve"> ecosystem: Building a platform that brings scientists and teachers together for minimally invasive research on human learning and teaching. </w:t>
+        <w:t xml:space="preserve">Heffernan, N. T., &amp; Heffernan, C. L. (2014). The ASSISTments ecosystem: Building a platform that brings scientists and teachers together for minimally invasive research on human learning and teaching. </w:t>
       </w:r>
       <w:r>
         <w:rPr>
@@ -10296,15 +9942,7 @@
         <w:jc w:val="left"/>
       </w:pPr>
       <w:r>
-        <w:t xml:space="preserve">Jiang, H., Zhang, X., Cao, X., Breazeal, C., Roy, D., &amp; Kabbara, J. (2023). </w:t>
-      </w:r>
-      <w:proofErr w:type="spellStart"/>
-      <w:r>
-        <w:t>PersonaLLM</w:t>
-      </w:r>
-      <w:proofErr w:type="spellEnd"/>
-      <w:r>
-        <w:t xml:space="preserve">: Investigating the ability of large language models to express personality traits. </w:t>
+        <w:t xml:space="preserve">Jiang, H., Zhang, X., Cao, X., Breazeal, C., Roy, D., &amp; Kabbara, J. (2023). PersonaLLM: Investigating the ability of large language models to express personality traits. </w:t>
       </w:r>
       <w:r>
         <w:rPr>
@@ -10330,13 +9968,8 @@
         <w:pStyle w:val="ReferenceEntry"/>
         <w:jc w:val="left"/>
       </w:pPr>
-      <w:proofErr w:type="spellStart"/>
-      <w:r>
-        <w:t>Kadavath</w:t>
-      </w:r>
-      <w:proofErr w:type="spellEnd"/>
-      <w:r>
-        <w:t xml:space="preserve">, S., et al. (2022). Language models (mostly) know what they know. </w:t>
+      <w:r>
+        <w:t xml:space="preserve">Kadavath, S., et al. (2022). Language models (mostly) know what they know. </w:t>
       </w:r>
       <w:r>
         <w:rPr>
@@ -10363,15 +9996,7 @@
         <w:jc w:val="left"/>
       </w:pPr>
       <w:r>
-        <w:t xml:space="preserve">Liu, J., et al. (2024). </w:t>
-      </w:r>
-      <w:proofErr w:type="spellStart"/>
-      <w:r>
-        <w:t>SocraticLM</w:t>
-      </w:r>
-      <w:proofErr w:type="spellEnd"/>
-      <w:r>
-        <w:t xml:space="preserve">: Exploring Socratic personalized teaching with large language models. In </w:t>
+        <w:t xml:space="preserve">Liu, J., et al. (2024). SocraticLM: Exploring Socratic personalized teaching with large language models. In </w:t>
       </w:r>
       <w:r>
         <w:rPr>
@@ -10474,15 +10099,7 @@
         <w:jc w:val="left"/>
       </w:pPr>
       <w:r>
-        <w:t xml:space="preserve">Pandey, S., &amp; </w:t>
-      </w:r>
-      <w:proofErr w:type="spellStart"/>
-      <w:r>
-        <w:t>Karypis</w:t>
-      </w:r>
-      <w:proofErr w:type="spellEnd"/>
-      <w:r>
-        <w:t xml:space="preserve">, G. (2019). A self-attentive model for knowledge tracing. In </w:t>
+        <w:t xml:space="preserve">Pandey, S., &amp; Karypis, G. (2019). A self-attentive model for knowledge tracing. In </w:t>
       </w:r>
       <w:r>
         <w:rPr>
@@ -10520,15 +10137,7 @@
         <w:jc w:val="left"/>
       </w:pPr>
       <w:r>
-        <w:t xml:space="preserve">Samuel, V., et al. (2024). </w:t>
-      </w:r>
-      <w:proofErr w:type="spellStart"/>
-      <w:r>
-        <w:t>PersonaGym</w:t>
-      </w:r>
-      <w:proofErr w:type="spellEnd"/>
-      <w:r>
-        <w:t xml:space="preserve">: Evaluating persona agents and LLMs. </w:t>
+        <w:t xml:space="preserve">Samuel, V., et al. (2024). PersonaGym: Evaluating persona agents and LLMs. </w:t>
       </w:r>
       <w:r>
         <w:rPr>
@@ -10554,22 +10163,9 @@
         <w:pStyle w:val="ReferenceEntry"/>
         <w:jc w:val="left"/>
       </w:pPr>
-      <w:proofErr w:type="spellStart"/>
       <w:r>
         <w:lastRenderedPageBreak/>
-        <w:t>Scarlatos</w:t>
-      </w:r>
-      <w:proofErr w:type="spellEnd"/>
-      <w:r>
-        <w:t xml:space="preserve">, A., Liu, N., Lee, J., </w:t>
-      </w:r>
-      <w:proofErr w:type="spellStart"/>
-      <w:r>
-        <w:t>Baraniuk</w:t>
-      </w:r>
-      <w:proofErr w:type="spellEnd"/>
-      <w:r>
-        <w:t xml:space="preserve">, R., &amp; Lan, A. (2025). Training LLM-based tutors to improve student learning outcomes in dialogues. </w:t>
+        <w:t xml:space="preserve">Scarlatos, A., Liu, N., Lee, J., Baraniuk, R., &amp; Lan, A. (2025). Training LLM-based tutors to improve student learning outcomes in dialogues. </w:t>
       </w:r>
       <w:r>
         <w:rPr>
@@ -10623,15 +10219,7 @@
         <w:jc w:val="left"/>
       </w:pPr>
       <w:r>
-        <w:t xml:space="preserve">Wang, Z. M., et al. (2023). </w:t>
-      </w:r>
-      <w:proofErr w:type="spellStart"/>
-      <w:r>
-        <w:t>RoleLLM</w:t>
-      </w:r>
-      <w:proofErr w:type="spellEnd"/>
-      <w:r>
-        <w:t xml:space="preserve">: Benchmarking, eliciting, and enhancing role-playing abilities of large language models. </w:t>
+        <w:t xml:space="preserve">Wang, Z. M., et al. (2023). RoleLLM: Benchmarking, eliciting, and enhancing role-playing abilities of large language models. </w:t>
       </w:r>
       <w:r>
         <w:rPr>
@@ -10658,15 +10246,7 @@
         <w:jc w:val="left"/>
       </w:pPr>
       <w:r>
-        <w:t xml:space="preserve">Weitekamp, D., </w:t>
-      </w:r>
-      <w:proofErr w:type="spellStart"/>
-      <w:r>
-        <w:t>Harpstead</w:t>
-      </w:r>
-      <w:proofErr w:type="spellEnd"/>
-      <w:r>
-        <w:t xml:space="preserve">, E., &amp; Koedinger, K. (2024). AI2T: Building trustable AI tutors by interactively teaching a self-aware learning agent. </w:t>
+        <w:t xml:space="preserve">Weitekamp, D., Harpstead, E., &amp; Koedinger, K. (2024). AI2T: Building trustable AI tutors by interactively teaching a self-aware learning agent. </w:t>
       </w:r>
       <w:r>
         <w:rPr>

</xml_diff>